<commit_message>
сессия: T1 R14.3 — C89 upper-bound pattern antecedent naming, revision log PART 5 added
Co-Authored-By: Claude Opus 5 <noreply@anthropic.com>
</commit_message>
<xml_diff>
--- a/Publications/T1_ITcon_DG_Draft_R14.3.docx
+++ b/Publications/T1_ITcon_DG_Draft_R14.3.docx
@@ -2286,31 +2286,13 @@
       <w:r>
         <w:t>The entire schema, including node labels, relationship types, and the complete class and property inventory, is maintained as a version-controlled, open ontology project (Ermolenko, 2026).</w:t>
       </w:r>
-      <w:r>
-        <w:rPr>
-          <w:lang w:val="en-US"/>
-        </w:rPr>
-        <w:t xml:space="preserve"/>
-      </w:r>
-      <w:r>
-        <w:t/>
-      </w:r>
       <w:commentRangeStart w:id="55"/>
-      <w:r>
-        <w:t/>
-      </w:r>
       <w:commentRangeEnd w:id="55"/>
       <w:r>
         <w:rPr>
           <w:rStyle w:val="af2"/>
         </w:rPr>
         <w:commentReference w:id="55"/>
-      </w:r>
-      <w:r>
-        <w:t/>
-      </w:r>
-      <w:r>
-        <w:t/>
       </w:r>
     </w:p>
     <w:p>
@@ -3836,14 +3818,9 @@
         <w:t xml:space="preserve"> Head, where the body atoms express the condition that violates the constraint and the head atom asserts a boolean violation flag. This inverted, violation-first semantics simplifies rule evaluation: a rule fires only if the constraint is broken, avoiding the need to reason over the complement of a positive condition. </w:t>
       </w:r>
       <w:commentRangeStart w:id="86"/>
-      <w:r>
-        <w:t xml:space="preserve">For example, the regulation that </w:t>
-      </w:r>
-      <w:r>
-        <w:t xml:space="preserve">the </w:t>
-      </w:r>
-      <w:r>
-        <w:t>maximum building height is 75 meters is encoded as:</w:t>
+      <w:commentRangeStart w:id="87"/>
+      <w:r>
+        <w:t>The upper-bound pattern is exemplified by the regulation that the maximum building height is 75 metres:</w:t>
       </w:r>
       <w:commentRangeEnd w:id="86"/>
       <w:r>
@@ -3851,6 +3828,13 @@
           <w:rStyle w:val="af2"/>
         </w:rPr>
         <w:commentReference w:id="86"/>
+      </w:r>
+      <w:commentRangeEnd w:id="87"/>
+      <w:r>
+        <w:rPr>
+          <w:rStyle w:val="af2"/>
+        </w:rPr>
+        <w:commentReference w:id="87"/>
       </w:r>
     </w:p>
     <w:p>
@@ -3913,7 +3897,7 @@
           <w:lang w:val="en-US"/>
         </w:rPr>
       </w:pPr>
-      <w:ins w:id="87" w:author="Scientific Paper Revision Agent" w:date="2026-08-24T00:00:00Z">
+      <w:ins w:id="88" w:author="Scientific Paper Revision Agent" w:date="2026-08-24T00:00:00Z">
         <w:r>
           <w:rPr>
             <w:lang w:val="en-US"/>
@@ -3942,7 +3926,7 @@
         </w:rPr>
         <w:t xml:space="preserve">: </w:t>
       </w:r>
-      <w:commentRangeStart w:id="88"/>
+      <w:commentRangeStart w:id="89"/>
       <w:r>
         <w:rPr>
           <w:lang w:val="en-US"/>
@@ -3977,29 +3961,29 @@
         </w:rPr>
         <w:t xml:space="preserve"> vocabulary.</w:t>
       </w:r>
-      <w:commentRangeEnd w:id="88"/>
+      <w:commentRangeEnd w:id="89"/>
       <w:r>
         <w:rPr>
           <w:rStyle w:val="af2"/>
           <w:i w:val="0"/>
         </w:rPr>
-        <w:commentReference w:id="88"/>
+        <w:commentReference w:id="89"/>
       </w:r>
     </w:p>
     <w:p>
       <w:r>
         <w:t xml:space="preserve">The complementary </w:t>
       </w:r>
-      <w:commentRangeStart w:id="89"/>
+      <w:commentRangeStart w:id="90"/>
       <w:r>
         <w:t xml:space="preserve">lower-bound pattern </w:t>
       </w:r>
-      <w:commentRangeEnd w:id="89"/>
+      <w:commentRangeEnd w:id="90"/>
       <w:r>
         <w:rPr>
           <w:rStyle w:val="af2"/>
         </w:rPr>
-        <w:commentReference w:id="89"/>
+        <w:commentReference w:id="90"/>
       </w:r>
       <w:r>
         <w:t xml:space="preserve">is exemplified by the constraint that a street </w:t>
@@ -4010,7 +3994,7 @@
       <w:r>
         <w:t xml:space="preserve"> a minimum width of 18 metres</w:t>
       </w:r>
-      <w:ins w:id="90" w:author="Scientific Paper Revision Agent" w:date="2026-08-24T00:00:00Z">
+      <w:ins w:id="91" w:author="Scientific Paper Revision Agent" w:date="2026-08-24T00:00:00Z">
         <w:r>
           <w:t>:</w:t>
         </w:r>
@@ -4023,7 +4007,7 @@
           <w:iCs/>
         </w:rPr>
       </w:pPr>
-      <w:ins w:id="91" w:author="Scientific Paper Revision Agent" w:date="2026-08-24T00:00:00Z">
+      <w:ins w:id="92" w:author="Scientific Paper Revision Agent" w:date="2026-08-24T00:00:00Z">
         <w:r>
           <w:rPr>
             <w:i/>
@@ -4034,7 +4018,7 @@
       </w:ins>
     </w:p>
     <w:p>
-      <w:ins w:id="92" w:author="Scientific Paper Revision Agent" w:date="2026-08-24T00:00:00Z">
+      <w:ins w:id="93" w:author="Scientific Paper Revision Agent" w:date="2026-08-24T00:00:00Z">
         <w:r>
           <w:t xml:space="preserve">The two rules share one atom structure and differ only in the comparison </w:t>
         </w:r>
@@ -4042,7 +4026,7 @@
       <w:r>
         <w:t>built-in</w:t>
       </w:r>
-      <w:ins w:id="93" w:author="Scientific Paper Revision Agent" w:date="2026-08-24T00:00:00Z">
+      <w:ins w:id="94" w:author="Scientific Paper Revision Agent" w:date="2026-08-24T00:00:00Z">
         <w:r>
           <w:t xml:space="preserve"> and the head predicate; where a single property is bounded both above and below, a true range constraint decomposes into exactly this pai</w:t>
         </w:r>
@@ -4059,7 +4043,7 @@
       <w:r>
         <w:t xml:space="preserve"> Each rule carries </w:t>
       </w:r>
-      <w:ins w:id="94" w:author="Scientific Paper Revision Agent" w:date="2026-08-24T00:00:00Z">
+      <w:ins w:id="95" w:author="Scientific Paper Revision Agent" w:date="2026-08-24T00:00:00Z">
         <w:r>
           <w:t>a structured identifier (e.g., R_BUILDING_MAX_HEIGHT_75_V)</w:t>
         </w:r>
@@ -4067,7 +4051,7 @@
       <w:r>
         <w:t>, is decomposed in the Metagraph into body and head atoms with ordered argument links to variables and literals, and is grounded in the Ontograph through REFERS_TO (</w:t>
       </w:r>
-      <w:ins w:id="95" w:author="Scientific Paper Revision Agent" w:date="2026-08-24T00:00:00Z">
+      <w:ins w:id="96" w:author="Scientific Paper Revision Agent" w:date="2026-08-24T00:00:00Z">
         <w:r>
           <w:t>Figure 6</w:t>
         </w:r>
@@ -4075,7 +4059,7 @@
       <w:r>
         <w:t xml:space="preserve">); </w:t>
       </w:r>
-      <w:ins w:id="96" w:author="Scientific Paper Revision Agent" w:date="2026-08-24T00:00:00Z">
+      <w:ins w:id="97" w:author="Scientific Paper Revision Agent" w:date="2026-08-24T00:00:00Z">
         <w:r>
           <w:t>Figure 9</w:t>
         </w:r>
@@ -4085,14 +4069,14 @@
       </w:r>
     </w:p>
     <w:p>
-      <w:ins w:id="97" w:author="Scientific Paper Revision Agent" w:date="2026-08-24T00:00:00Z">
+      <w:ins w:id="98" w:author="Scientific Paper Revision Agent" w:date="2026-08-24T00:00:00Z">
         <w:r>
           <w:t>The encoding also covers rules that do not bound a dimension. A facade grammar for a hexagonal curtain-wall system shows the range of forms the same violation pattern absorbs. The four clauses below are encoding illustrations: they show how a grammar stated in a designer’s own terms decomposes under the schema, and the vocabulary they use is the per-project vocabulary a rule author would generate rather than core terminology. A grid whose pattern departs from the intended typology is the qualitative case:</w:t>
         </w:r>
       </w:ins>
     </w:p>
     <w:p>
-      <w:ins w:id="98" w:author="Scientific Paper Revision Agent" w:date="2026-08-24T00:00:00Z">
+      <w:ins w:id="99" w:author="Scientific Paper Revision Agent" w:date="2026-08-24T00:00:00Z">
         <w:r>
           <w:t>FacadeGrid(?g) ∧ hasGridPattern(?g, ?p) ∧ swrlb:notEqual(?p, "hexagonal") → violatesHexagonalPattern(?g, true)</w:t>
         </w:r>
@@ -4101,10 +4085,10 @@
     <w:p>
       <w:pPr>
         <w:rPr>
-          <w:ins w:id="99" w:author="Scientific Paper Revision Agent" w:date="2026-08-24T00:00:00Z"/>
-        </w:rPr>
-      </w:pPr>
-      <w:ins w:id="100" w:author="Scientific Paper Revision Agent" w:date="2026-08-24T00:00:00Z">
+          <w:ins w:id="100" w:author="Scientific Paper Revision Agent" w:date="2026-08-24T00:00:00Z"/>
+        </w:rPr>
+      </w:pPr>
+      <w:ins w:id="101" w:author="Scientific Paper Revision Agent" w:date="2026-08-24T00:00:00Z">
         <w:r>
           <w:t>Alignment of a unit’s vertices to the building’s level planes traverses a relation rather than reads a value, and the violation form tests the alignment flag the geometry engine computes:</w:t>
         </w:r>
@@ -4113,10 +4097,10 @@
     <w:p>
       <w:pPr>
         <w:rPr>
-          <w:ins w:id="101" w:author="Scientific Paper Revision Agent" w:date="2026-08-24T00:00:00Z"/>
-        </w:rPr>
-      </w:pPr>
-      <w:ins w:id="102" w:author="Scientific Paper Revision Agent" w:date="2026-08-24T00:00:00Z">
+          <w:ins w:id="102" w:author="Scientific Paper Revision Agent" w:date="2026-08-24T00:00:00Z"/>
+        </w:rPr>
+      </w:pPr>
+      <w:ins w:id="103" w:author="Scientific Paper Revision Agent" w:date="2026-08-24T00:00:00Z">
         <w:r>
           <w:t>HexagonalUnit(?u) ∧ hasVertex(?u, ?v) ∧ isLevelAligned(?v, ?a) ∧ swrlb:notEqual(?a, true) → violatesLevelAlignment(?v, true)</w:t>
         </w:r>
@@ -4125,10 +4109,10 @@
     <w:p>
       <w:pPr>
         <w:rPr>
-          <w:ins w:id="103" w:author="Scientific Paper Revision Agent" w:date="2026-08-24T00:00:00Z"/>
-        </w:rPr>
-      </w:pPr>
-      <w:ins w:id="104" w:author="Scientific Paper Revision Agent" w:date="2026-08-24T00:00:00Z">
+          <w:ins w:id="104" w:author="Scientific Paper Revision Agent" w:date="2026-08-24T00:00:00Z"/>
+        </w:rPr>
+      </w:pPr>
+      <w:ins w:id="105" w:author="Scientific Paper Revision Agent" w:date="2026-08-24T00:00:00Z">
         <w:r>
           <w:t>Symmetry of the repeating unit is a property of the unit as a whole, and reduces to the same boolean test:</w:t>
         </w:r>
@@ -4137,10 +4121,10 @@
     <w:p>
       <w:pPr>
         <w:rPr>
-          <w:ins w:id="105" w:author="Scientific Paper Revision Agent" w:date="2026-08-24T00:00:00Z"/>
-        </w:rPr>
-      </w:pPr>
-      <w:ins w:id="106" w:author="Scientific Paper Revision Agent" w:date="2026-08-24T00:00:00Z">
+          <w:ins w:id="106" w:author="Scientific Paper Revision Agent" w:date="2026-08-24T00:00:00Z"/>
+        </w:rPr>
+      </w:pPr>
+      <w:ins w:id="107" w:author="Scientific Paper Revision Agent" w:date="2026-08-24T00:00:00Z">
         <w:r>
           <w:t>HexagonalUnit(?u) ∧ hasMirrorSymmetry(?u, ?s) ∧ swrlb:notEqual(?s, true) → violatesUnitSymmetry(?u, true)</w:t>
         </w:r>
@@ -4149,7 +4133,7 @@
     <w:p>
       <w:pPr>
         <w:rPr>
-          <w:ins w:id="107" w:author="Scientific Paper Revision Agent" w:date="2026-08-24T00:00:00Z"/>
+          <w:ins w:id="108" w:author="Scientific Paper Revision Agent" w:date="2026-08-24T00:00:00Z"/>
         </w:rPr>
       </w:pPr>
       <w:r>
@@ -4159,10 +4143,10 @@
     <w:p>
       <w:pPr>
         <w:rPr>
-          <w:ins w:id="108" w:author="Scientific Paper Revision Agent" w:date="2026-08-24T00:00:00Z"/>
-        </w:rPr>
-      </w:pPr>
-      <w:ins w:id="109" w:author="Scientific Paper Revision Agent" w:date="2026-08-24T00:00:00Z">
+          <w:ins w:id="109" w:author="Scientific Paper Revision Agent" w:date="2026-08-24T00:00:00Z"/>
+        </w:rPr>
+      </w:pPr>
+      <w:ins w:id="110" w:author="Scientific Paper Revision Agent" w:date="2026-08-24T00:00:00Z">
         <w:r>
           <w:t>GlassPanel(?p) ∧ hasAspectRatio(?p, ?r) ∧ swrlb:greaterThan(?r, 4.0) → violatesPanelSlenderness(?p, true)</w:t>
         </w:r>
@@ -4173,7 +4157,7 @@
         <w:lastRenderedPageBreak/>
         <w:t>The four clauses vary in their focus—namely, a typology, a traversed relation, a property of a whole, and a computed ratio.</w:t>
       </w:r>
-      <w:ins w:id="110" w:author="Scientific Paper Revision Agent" w:date="2026-08-24T00:00:00Z">
+      <w:ins w:id="111" w:author="Scientific Paper Revision Agent" w:date="2026-08-24T00:00:00Z">
         <w:r>
           <w:t xml:space="preserve"> — while sharing one structure: a class atom that scopes the rule, atoms that reach the values it depends on, a </w:t>
         </w:r>
@@ -4181,11 +4165,11 @@
       <w:r>
         <w:t>built-in</w:t>
       </w:r>
-      <w:ins w:id="111" w:author="Scientific Paper Revision Agent" w:date="2026-08-24T00:00:00Z">
+      <w:ins w:id="112" w:author="Scientific Paper Revision Agent" w:date="2026-08-24T00:00:00Z">
         <w:r>
           <w:t xml:space="preserve"> that decides, and a head that records the finding. </w:t>
         </w:r>
-        <w:commentRangeStart w:id="112"/>
+        <w:commentRangeStart w:id="113"/>
         <w:r>
           <w:t>Only the second reaches beyond what the validator evaluates today. Its second atom is an object-property atom, a type the Metagraph declares and decomposes</w:t>
         </w:r>
@@ -4193,19 +4177,19 @@
       <w:r>
         <w:t>,</w:t>
       </w:r>
-      <w:ins w:id="113" w:author="Scientific Paper Revision Agent" w:date="2026-08-24T00:00:00Z">
+      <w:ins w:id="114" w:author="Scientific Paper Revision Agent" w:date="2026-08-24T00:00:00Z">
         <w:r>
           <w:t xml:space="preserve"> but the SWRL validator does not yet execute</w:t>
         </w:r>
       </w:ins>
-      <w:commentRangeEnd w:id="112"/>
+      <w:commentRangeEnd w:id="113"/>
       <w:r>
         <w:rPr>
           <w:rStyle w:val="af2"/>
         </w:rPr>
-        <w:commentReference w:id="112"/>
-      </w:r>
-      <w:ins w:id="114" w:author="Scientific Paper Revision Agent" w:date="2026-08-24T00:00:00Z">
+        <w:commentReference w:id="113"/>
+      </w:r>
+      <w:ins w:id="115" w:author="Scientific Paper Revision Agent" w:date="2026-08-24T00:00:00Z">
         <w:r>
           <w:t>, so the clause is representable and auditable in the schema while its evaluation waits on the validator. The other three use only the class, data-property and built-in atom types the validator handles.</w:t>
         </w:r>
@@ -4221,7 +4205,7 @@
       <w:r>
         <w:t xml:space="preserve"> proven effective for cross-domain building data (Hagedorn et al., 2023). </w:t>
       </w:r>
-      <w:ins w:id="115" w:author="Scientific Paper Revision Agent" w:date="2026-08-24T00:00:00Z">
+      <w:ins w:id="116" w:author="Scientific Paper Revision Agent" w:date="2026-08-24T00:00:00Z">
         <w:r>
           <w:t>The two terminological services run in an isolated reasoner sidecar — a separate process that assembles the RDF projection and runs the OWL and SHACL engines without holding a lock on the graph database — while SWRL evaluation is performed where the design state is authored, so that a rule check does not depend on a projection being current. Their verdicts are persisted to the ValidGraph beside the design states they judge, so the evidence trail of every compliance claim (rule, state, service, verdict) is reconstructible from the graph alone.</w:t>
         </w:r>
@@ -4318,16 +4302,16 @@
       </w:r>
     </w:p>
     <w:p>
-      <w:commentRangeStart w:id="116"/>
+      <w:commentRangeStart w:id="117"/>
       <w:r>
         <w:t xml:space="preserve">The ontology is specified in OWL 2 DL and its rules in SWRL, but the runtime graph is a Neo4j labelled-property graph, not a triple store — the two are different data models, and the mapping between them is stated explicitly. </w:t>
       </w:r>
-      <w:commentRangeEnd w:id="116"/>
+      <w:commentRangeEnd w:id="117"/>
       <w:r>
         <w:rPr>
           <w:rStyle w:val="af2"/>
         </w:rPr>
-        <w:commentReference w:id="116"/>
+        <w:commentReference w:id="117"/>
       </w:r>
       <w:r>
         <w:t>A normative, versioned mapping fixes the projection in both directions: every property-graph node label, relationship type, and edge property maps onto a standard term from the W3C OWL and SWRL RDF vocabularies, and the mapping is exercised at reasoning time.</w:t>
@@ -4354,7 +4338,7 @@
       <w:r>
         <w:t xml:space="preserve"> </w:t>
       </w:r>
-      <w:ins w:id="117" w:author="Scientific Paper Revision Agent" w:date="2026-08-24T00:00:00Z">
+      <w:ins w:id="118" w:author="Scientific Paper Revision Agent" w:date="2026-08-24T00:00:00Z">
         <w:r>
           <w:t>and rules whose bodies contain SWRL built-in atoms outside the OWL 2 DL profile are withheld from the terminological run, with the withheld count reported alongside the verdict. The consistency verdict therefore applies to the terminology, not to the rule corpus, and the reported count indicates how much of the corpus the verdict does not cover.</w:t>
         </w:r>
@@ -4368,14 +4352,14 @@
       <w:r>
         <w:t xml:space="preserve">The OWL 2 DL reasoner and the SHACL validator operate on an RDF projection, assembled on demand by the isolated reasoner sidecar, which unions the static core TBox, a curated disjointness-axiom overlay, and the live per-project export. This ensures that terminological reasoning never blocks the validation path and that a reasoner failure cannot corrupt the graph it reasons about. </w:t>
       </w:r>
-      <w:ins w:id="118" w:author="Scientific Paper Revision Agent" w:date="2026-08-24T00:00:00Z">
+      <w:ins w:id="119" w:author="Scientific Paper Revision Agent" w:date="2026-08-24T00:00:00Z">
         <w:r>
           <w:t>All three verdicts are written back to the same ValidGraph, but each is recorded under its own property and tagged with the service that produced it, so a structural verdict is distinguishable from a rule verdict. A single destination with source tagging allows one evidence trail to carry findings from services that do not share a data model.</w:t>
         </w:r>
       </w:ins>
     </w:p>
     <w:p>
-      <w:ins w:id="119" w:author="Scientific Paper Revision Agent" w:date="2026-08-24T00:00:00Z">
+      <w:ins w:id="120" w:author="Scientific Paper Revision Agent" w:date="2026-08-24T00:00:00Z">
         <w:r>
           <w:t xml:space="preserve">The property-graph commitment was made for three operational reasons. The authoring workflow is write-heavy — rules, states and runs accumulate continuously as a scheme develops — and a property graph absorbs that pattern natively, where a triple store would place a serialisation step before every write. The query surface is already familiar to the BIM-adjacent tooling ecosystem, which lowers the cost of the connectors the schema depends on. The commitment also admits migration: the Graph Query Language (GQL) standard (ISO/IEC, 2024) defines graph types as a schema layer for property graphs, providing a vendor-neutral path beyond any single database product. </w:t>
         </w:r>
@@ -4415,7 +4399,7 @@
       <w:r>
         <w:t xml:space="preserve"> decision (</w:t>
       </w:r>
-      <w:ins w:id="120" w:author="Scientific Paper Revision Agent" w:date="2026-08-24T00:00:00Z">
+      <w:ins w:id="121" w:author="Scientific Paper Revision Agent" w:date="2026-08-24T00:00:00Z">
         <w:r>
           <w:t>Figure 7</w:t>
         </w:r>
@@ -4515,7 +4499,7 @@
           <w:lang w:val="en-US"/>
         </w:rPr>
       </w:pPr>
-      <w:ins w:id="121" w:author="Scientific Paper Revision Agent" w:date="2026-08-24T00:00:00Z">
+      <w:ins w:id="122" w:author="Scientific Paper Revision Agent" w:date="2026-08-24T00:00:00Z">
         <w:r>
           <w:rPr>
             <w:lang w:val="en-US"/>
@@ -4560,7 +4544,7 @@
       </w:r>
     </w:p>
     <w:p>
-      <w:commentRangeStart w:id="122"/>
+      <w:commentRangeStart w:id="123"/>
       <w:r>
         <w:t xml:space="preserve">The ComputGraph acquires its content </w:t>
       </w:r>
@@ -4648,7 +4632,7 @@
       <w:r>
         <w:t xml:space="preserve"> behind a provider-agnostic gateway, reflecting the emerging pattern of protocol-mediated agentic BIM interaction (Heimig-Elschner et al., 2026). Every call is prepared by a context assembler — a service that compiles the current ontology catalogue, the SWRL conventions, and </w:t>
       </w:r>
-      <w:ins w:id="123" w:author="Scientific Paper Revision Agent" w:date="2026-08-24T00:00:00Z">
+      <w:ins w:id="124" w:author="Scientific Paper Revision Agent" w:date="2026-08-24T00:00:00Z">
         <w:r>
           <w:t>a versioned library of parameterised query templates into the model's context, scoped to the definition under consideration and bounded by a declared entity budget whose truncation is reported in the response</w:t>
         </w:r>
@@ -4659,7 +4643,7 @@
       <w:r>
         <w:t xml:space="preserve">— and every generated statement is schema-validated before it reaches the graph, the graph-grounded discipline that distinguishes reliable text-to-Cypher systems (Gusarov et al., 2025). </w:t>
       </w:r>
-      <w:ins w:id="124" w:author="Scientific Paper Revision Agent" w:date="2026-08-24T00:00:00Z">
+      <w:ins w:id="125" w:author="Scientific Paper Revision Agent" w:date="2026-08-24T00:00:00Z">
         <w:r>
           <w:t>Rule encoding runs through the same assembler. Encoding proceeds in stages. A natural-language constraint is first resolved against the Ontograph entities the project already declares; where a term the constraint needs has no counterpart there, that entity is declared and the Ontograph grows to hold it before any rule is written. The Ontograph is in this sense a generative part of the schema rather than a fixed vocabulary — it is enriched in step with the constraints a project accumulates — and it is the layer that governs which entities a SWRL expression may name. Against that resolved vocabulary the constraint is matched to a versioned catalogue of rule shapes, each pairing a constraint form — upper bound, lower bound, range, ratio, count, boolean requirement — with the atom sequence it decomposes into, the graph write that creates those atoms, and a worked example. The model's task is therefore classification and slot-filling against known components rather than free-form formalisation: it selects the shape, then identifies the class, the data property, the comparison and the bound, and the atoms are constructed by template. Every write is checked against the permitted labels, relationship types and key-name conventions of the schema before it reaches the graph, so a malformed construction is refused structurally even where the vocabulary it names is new. The model is thereby confined to encoding, and the resulting rule is auditable atom by atom (section 5.1): its structure comes from the catalogue and its vocabulary from the Ontograph. The interaction contract is conservative:</w:t>
         </w:r>
@@ -4671,12 +4655,12 @@
         <w:lastRenderedPageBreak/>
         <w:t>snapshots are diffable — the evolution of the generative process itself, not only of its outputs, becomes queryable — and a rule-aware consulting agent answers design questions against the graph, proposing but never executing canvas actions. In parallel, the SpecGraph accumulates decisions, debugging notes, and conventions beside the formal rules they explain, addressing the knowledge-loss problem long documented for design rationale in the AEC industry (Wyke &amp; Lindhard, 2025).</w:t>
       </w:r>
-      <w:commentRangeEnd w:id="122"/>
+      <w:commentRangeEnd w:id="123"/>
       <w:r>
         <w:rPr>
           <w:rStyle w:val="af2"/>
         </w:rPr>
-        <w:commentReference w:id="122"/>
+        <w:commentReference w:id="123"/>
       </w:r>
     </w:p>
     <w:p>
@@ -4698,7 +4682,7 @@
       <w:r>
         <w:t>(</w:t>
       </w:r>
-      <w:ins w:id="125" w:author="Scientific Paper Revision Agent" w:date="2026-08-24T00:00:00Z">
+      <w:ins w:id="126" w:author="Scientific Paper Revision Agent" w:date="2026-08-24T00:00:00Z">
         <w:r>
           <w:t>Table 2</w:t>
         </w:r>
@@ -4781,7 +4765,7 @@
         </w:rPr>
         <w:t xml:space="preserve"> record who ingested or edited the rule, from which prompt, and with what result. The intended application is shared, versioned rule libraries communicated across offices and disciplines, with atom-level audit of every revision. </w:t>
       </w:r>
-      <w:ins w:id="126" w:author="Scientific Paper Revision Agent" w:date="2026-08-24T00:00:00Z">
+      <w:ins w:id="127" w:author="Scientific Paper Revision Agent" w:date="2026-08-24T00:00:00Z">
         <w:r>
           <w:rPr>
             <w:lang w:val="en-US"/>
@@ -4810,7 +4794,7 @@
         </w:rPr>
         <w:t>MATCH (r:Rule {Rule_Id:'</w:t>
       </w:r>
-      <w:ins w:id="127" w:author="Scientific Paper Revision Agent" w:date="2026-08-24T00:00:00Z">
+      <w:ins w:id="128" w:author="Scientific Paper Revision Agent" w:date="2026-08-24T00:00:00Z">
         <w:r>
           <w:rPr>
             <w:i/>
@@ -5077,7 +5061,7 @@
             <w:tcW w:w="1736" w:type="dxa"/>
           </w:tcPr>
           <w:p>
-            <w:ins w:id="128" w:author="Scientific Paper Revision Agent" w:date="2026-08-24T00:00:00Z">
+            <w:ins w:id="129" w:author="Scientific Paper Revision Agent" w:date="2026-08-24T00:00:00Z">
               <w:r>
                 <w:rPr>
                   <w:sz w:val="16"/>
@@ -5085,7 +5069,7 @@
                 <w:t>ex:hasHeightM</w:t>
               </w:r>
             </w:ins>
-            <w:del w:id="129" w:author="Scientific Paper Revision Agent" w:date="2026-08-24T00:00:00Z">
+            <w:del w:id="130" w:author="Scientific Paper Revision Agent" w:date="2026-08-24T00:00:00Z">
               <w:r>
                 <w:rPr>
                   <w:sz w:val="16"/>
@@ -5167,7 +5151,7 @@
             <w:tcW w:w="1736" w:type="dxa"/>
           </w:tcPr>
           <w:p>
-            <w:ins w:id="130" w:author="Scientific Paper Revision Agent" w:date="2026-08-24T00:00:00Z">
+            <w:ins w:id="131" w:author="Scientific Paper Revision Agent" w:date="2026-08-24T00:00:00Z">
               <w:r>
                 <w:rPr>
                   <w:sz w:val="16"/>
@@ -5175,7 +5159,7 @@
                 <w:t>ex:hasHeightM</w:t>
               </w:r>
             </w:ins>
-            <w:del w:id="131" w:author="Scientific Paper Revision Agent" w:date="2026-08-24T00:00:00Z">
+            <w:del w:id="132" w:author="Scientific Paper Revision Agent" w:date="2026-08-24T00:00:00Z">
               <w:r>
                 <w:rPr>
                   <w:sz w:val="16"/>
@@ -5203,7 +5187,7 @@
             <w:tcW w:w="1696" w:type="dxa"/>
           </w:tcPr>
           <w:p>
-            <w:ins w:id="132" w:author="Scientific Paper Revision Agent" w:date="2026-08-24T00:00:00Z">
+            <w:ins w:id="133" w:author="Scientific Paper Revision Agent" w:date="2026-08-24T00:00:00Z">
               <w:r>
                 <w:rPr>
                   <w:sz w:val="16"/>
@@ -5211,7 +5195,7 @@
                 <w:t>?h</w:t>
               </w:r>
             </w:ins>
-            <w:del w:id="133" w:author="Scientific Paper Revision Agent" w:date="2026-08-24T00:00:00Z">
+            <w:del w:id="134" w:author="Scientific Paper Revision Agent" w:date="2026-08-24T00:00:00Z">
               <w:r>
                 <w:rPr>
                   <w:sz w:val="16"/>
@@ -5267,7 +5251,7 @@
             <w:tcW w:w="1736" w:type="dxa"/>
           </w:tcPr>
           <w:p>
-            <w:ins w:id="134" w:author="Scientific Paper Revision Agent" w:date="2026-08-24T00:00:00Z">
+            <w:ins w:id="135" w:author="Scientific Paper Revision Agent" w:date="2026-08-24T00:00:00Z">
               <w:r>
                 <w:rPr>
                   <w:sz w:val="16"/>
@@ -5275,7 +5259,7 @@
                 <w:t>swrlb:greaterThan</w:t>
               </w:r>
             </w:ins>
-            <w:del w:id="135" w:author="Scientific Paper Revision Agent" w:date="2026-08-24T00:00:00Z">
+            <w:del w:id="136" w:author="Scientific Paper Revision Agent" w:date="2026-08-24T00:00:00Z">
               <w:r>
                 <w:rPr>
                   <w:sz w:val="16"/>
@@ -5303,7 +5287,7 @@
             <w:tcW w:w="1696" w:type="dxa"/>
           </w:tcPr>
           <w:p>
-            <w:ins w:id="136" w:author="Scientific Paper Revision Agent" w:date="2026-08-24T00:00:00Z">
+            <w:ins w:id="137" w:author="Scientific Paper Revision Agent" w:date="2026-08-24T00:00:00Z">
               <w:r>
                 <w:rPr>
                   <w:sz w:val="16"/>
@@ -5311,7 +5295,7 @@
                 <w:t>?h</w:t>
               </w:r>
             </w:ins>
-            <w:del w:id="137" w:author="Scientific Paper Revision Agent" w:date="2026-08-24T00:00:00Z">
+            <w:del w:id="138" w:author="Scientific Paper Revision Agent" w:date="2026-08-24T00:00:00Z">
               <w:r>
                 <w:rPr>
                   <w:sz w:val="16"/>
@@ -5367,7 +5351,7 @@
             <w:tcW w:w="1736" w:type="dxa"/>
           </w:tcPr>
           <w:p>
-            <w:ins w:id="138" w:author="Scientific Paper Revision Agent" w:date="2026-08-24T00:00:00Z">
+            <w:ins w:id="139" w:author="Scientific Paper Revision Agent" w:date="2026-08-24T00:00:00Z">
               <w:r>
                 <w:rPr>
                   <w:sz w:val="16"/>
@@ -5375,7 +5359,7 @@
                 <w:t>swrlb:greaterThan</w:t>
               </w:r>
             </w:ins>
-            <w:del w:id="139" w:author="Scientific Paper Revision Agent" w:date="2026-08-24T00:00:00Z">
+            <w:del w:id="140" w:author="Scientific Paper Revision Agent" w:date="2026-08-24T00:00:00Z">
               <w:r>
                 <w:rPr>
                   <w:sz w:val="16"/>
@@ -5403,7 +5387,7 @@
             <w:tcW w:w="1696" w:type="dxa"/>
           </w:tcPr>
           <w:p>
-            <w:ins w:id="140" w:author="Scientific Paper Revision Agent" w:date="2026-08-24T00:00:00Z">
+            <w:ins w:id="141" w:author="Scientific Paper Revision Agent" w:date="2026-08-24T00:00:00Z">
               <w:r>
                 <w:rPr>
                   <w:sz w:val="16"/>
@@ -5411,7 +5395,7 @@
                 <w:t>75</w:t>
               </w:r>
             </w:ins>
-            <w:del w:id="141" w:author="Scientific Paper Revision Agent" w:date="2026-08-24T00:00:00Z">
+            <w:del w:id="142" w:author="Scientific Paper Revision Agent" w:date="2026-08-24T00:00:00Z">
               <w:r>
                 <w:rPr>
                   <w:sz w:val="16"/>
@@ -5467,7 +5451,7 @@
             <w:tcW w:w="1736" w:type="dxa"/>
           </w:tcPr>
           <w:p>
-            <w:ins w:id="142" w:author="Scientific Paper Revision Agent" w:date="2026-08-24T00:00:00Z">
+            <w:ins w:id="143" w:author="Scientific Paper Revision Agent" w:date="2026-08-24T00:00:00Z">
               <w:r>
                 <w:rPr>
                   <w:sz w:val="16"/>
@@ -5475,7 +5459,7 @@
                 <w:t>ex:violatesMaxHeight</w:t>
               </w:r>
             </w:ins>
-            <w:del w:id="143" w:author="Scientific Paper Revision Agent" w:date="2026-08-24T00:00:00Z">
+            <w:del w:id="144" w:author="Scientific Paper Revision Agent" w:date="2026-08-24T00:00:00Z">
               <w:r>
                 <w:rPr>
                   <w:sz w:val="16"/>
@@ -5557,7 +5541,7 @@
             <w:tcW w:w="1736" w:type="dxa"/>
           </w:tcPr>
           <w:p>
-            <w:ins w:id="144" w:author="Scientific Paper Revision Agent" w:date="2026-08-24T00:00:00Z">
+            <w:ins w:id="145" w:author="Scientific Paper Revision Agent" w:date="2026-08-24T00:00:00Z">
               <w:r>
                 <w:rPr>
                   <w:sz w:val="16"/>
@@ -5565,7 +5549,7 @@
                 <w:t>ex:violatesMaxHeight</w:t>
               </w:r>
             </w:ins>
-            <w:del w:id="145" w:author="Scientific Paper Revision Agent" w:date="2026-08-24T00:00:00Z">
+            <w:del w:id="146" w:author="Scientific Paper Revision Agent" w:date="2026-08-24T00:00:00Z">
               <w:r>
                 <w:rPr>
                   <w:sz w:val="16"/>
@@ -5610,7 +5594,7 @@
       <w:pPr>
         <w:pStyle w:val="a3"/>
       </w:pPr>
-      <w:ins w:id="146" w:author="Scientific Paper Revision Agent" w:date="2026-08-24T00:00:00Z">
+      <w:ins w:id="147" w:author="Scientific Paper Revision Agent" w:date="2026-08-24T00:00:00Z">
         <w:r>
           <w:t>Table 5</w:t>
         </w:r>
@@ -5635,7 +5619,7 @@
       <w:r>
         <w:t xml:space="preserve">The seven returned rows are exactly the rule's three body atoms (a ClassAtom grounded in ex:Building, </w:t>
       </w:r>
-      <w:ins w:id="147" w:author="Scientific Paper Revision Agent" w:date="2026-08-24T00:00:00Z">
+      <w:ins w:id="148" w:author="Scientific Paper Revision Agent" w:date="2026-08-24T00:00:00Z">
         <w:r>
           <w:t>a DataPropertyAtom grounded in ex:hasHeightM, and a BuiltinAtom grounded in swrlb:greaterThan) and one head atom (grounded in ex:violatesMaxHeight</w:t>
         </w:r>
@@ -5646,7 +5630,7 @@
       <w:r>
         <w:t xml:space="preserve">, each with its ordered arguments. </w:t>
       </w:r>
-      <w:ins w:id="148" w:author="Scientific Paper Revision Agent" w:date="2026-08-24T00:00:00Z">
+      <w:ins w:id="149" w:author="Scientific Paper Revision Agent" w:date="2026-08-24T00:00:00Z">
         <w:r>
           <w:t>Figure 9</w:t>
         </w:r>
@@ -5654,13 +5638,13 @@
       <w:r>
         <w:t>a renders the same rows as a populated subgraph. Every atom is individually addressable and re-queryable, the rule carries its natural-language description alongside its structured identifier and SWRL string side by side, and every REFERS_TO edge grounds an atom in a class or property that the Ontograph, not the rule, owns — so each vocabulary term is defined once. The result answers CQ1: the query returns the decomposition and the grounding.</w:t>
       </w:r>
-      <w:commentRangeStart w:id="149"/>
-      <w:commentRangeEnd w:id="149"/>
+      <w:commentRangeStart w:id="150"/>
+      <w:commentRangeEnd w:id="150"/>
       <w:r>
         <w:rPr>
           <w:rStyle w:val="af2"/>
         </w:rPr>
-        <w:commentReference w:id="149"/>
+        <w:commentReference w:id="150"/>
       </w:r>
     </w:p>
     <w:p>
@@ -5768,7 +5752,7 @@
         <w:pStyle w:val="a3"/>
         <w:jc w:val="center"/>
       </w:pPr>
-      <w:ins w:id="150" w:author="Scientific Paper Revision Agent" w:date="2026-08-24T00:00:00Z">
+      <w:ins w:id="151" w:author="Scientific Paper Revision Agent" w:date="2026-08-24T00:00:00Z">
         <w:r>
           <w:t>Figure 8</w:t>
         </w:r>
@@ -5788,7 +5772,7 @@
       <w:r>
         <w:t xml:space="preserve">: </w:t>
       </w:r>
-      <w:ins w:id="151" w:author="Scientific Paper Revision Agent" w:date="2026-08-24T00:00:00Z">
+      <w:ins w:id="152" w:author="Scientific Paper Revision Agent" w:date="2026-08-24T00:00:00Z">
         <w:r>
           <w:t>Validation-run results per object as shown in the Design Grammars platform interface: the Design State panel with its per-object verdicts, beside the 3D viewport the run was computed against.</w:t>
         </w:r>
@@ -5804,13 +5788,13 @@
       <w:r>
         <w:t xml:space="preserve">Because the violation-pattern semantics makes the absence of a recorded violation a positive statement of compliance only once the graph is known to be fully populated (section 6.1), the run additionally records SendStatus, confirming that the complete result set (57 entities) was published to the platform. The same mechanism composes across constraint categories without change: the masterplan's rule catalogue already includes minimum-separation (R_BUILDING_MIN_DISTANCE_12_V, section 3.4), minimum floor-plate area, and minimum street width rules following the identical decomposition pattern; a single rule can attach any number of validation runs matched with Design States, which then can be evaluated in comparison across </w:t>
       </w:r>
-      <w:commentRangeStart w:id="152"/>
+      <w:commentRangeStart w:id="153"/>
       <w:r>
         <w:t>iterative development cycles.</w:t>
       </w:r>
-      <w:commentRangeEnd w:id="152"/>
-      <w:r>
-        <w:commentReference w:id="152"/>
+      <w:commentRangeEnd w:id="153"/>
+      <w:r>
+        <w:commentReference w:id="153"/>
       </w:r>
     </w:p>
     <w:p>
@@ -5873,7 +5857,7 @@
         <w:pStyle w:val="a3"/>
         <w:jc w:val="center"/>
       </w:pPr>
-      <w:ins w:id="153" w:author="Scientific Paper Revision Agent" w:date="2026-08-24T00:00:00Z">
+      <w:ins w:id="154" w:author="Scientific Paper Revision Agent" w:date="2026-08-24T00:00:00Z">
         <w:r>
           <w:t>Figure 9</w:t>
         </w:r>
@@ -5893,7 +5877,7 @@
       <w:r>
         <w:t xml:space="preserve">: A populated subgraph read back from the running system — (a) </w:t>
       </w:r>
-      <w:ins w:id="154" w:author="Scientific Paper Revision Agent" w:date="2026-08-24T00:00:00Z">
+      <w:ins w:id="155" w:author="Scientific Paper Revision Agent" w:date="2026-08-24T00:00:00Z">
         <w:r>
           <w:t>the maximum-height rule's</w:t>
         </w:r>
@@ -5904,7 +5888,7 @@
       <w:r>
         <w:t xml:space="preserve">full atom decomposition and grounding (CQ1, §5.1); </w:t>
       </w:r>
-      <w:ins w:id="155" w:author="Scientific Paper Revision Agent" w:date="2026-08-24T00:00:00Z">
+      <w:ins w:id="156" w:author="Scientific Paper Revision Agent" w:date="2026-08-24T00:00:00Z">
         <w:r>
           <w:t>(b) the persisted validation run and its per-object verdicts (CQ2, §5.2), with the property values as stored in the deposited module.</w:t>
         </w:r>
@@ -5936,7 +5920,7 @@
         </w:rPr>
         <w:t>CQ3 asks whether a planning-constraint rule can be traced to the specific parametric quantity it constrains and, conversely, whether a parameter can report which rules govern it — the mechanism a design-space-exploration workflow uses to filter candidate configurations. The schema realises this as the ATTRIBUTE_OF bridge, a domain-Atom, range-Parameter relationship (section 3.2) that connects the atom carrying the constrained quantity to the ComputGraph parameter that produces its value (section 3.5). For the minimum-separation rule of section 3.4, the constrained quantity is the distance ?d bound by the DataPropertyAtom grounded in ex:hasDistanceM — the rule's second body atom (</w:t>
       </w:r>
-      <w:ins w:id="156" w:author="Scientific Paper Revision Agent" w:date="2026-08-24T00:00:00Z">
+      <w:ins w:id="157" w:author="Scientific Paper Revision Agent" w:date="2026-08-24T00:00:00Z">
         <w:r>
           <w:rPr>
             <w:szCs w:val="18"/>
@@ -6229,8 +6213,8 @@
           <w:szCs w:val="22"/>
         </w:rPr>
       </w:pPr>
-      <w:commentRangeStart w:id="157"/>
-      <w:ins w:id="158" w:author="Scientific Paper Revision Agent" w:date="2026-08-24T00:00:00Z">
+      <w:commentRangeStart w:id="158"/>
+      <w:ins w:id="159" w:author="Scientific Paper Revision Agent" w:date="2026-08-24T00:00:00Z">
         <w:r>
           <w:t>Table 6</w:t>
         </w:r>
@@ -6257,13 +6241,13 @@
         </w:rPr>
         <w:t xml:space="preserve">CQ3 result </w:t>
       </w:r>
-      <w:commentRangeEnd w:id="157"/>
+      <w:commentRangeEnd w:id="158"/>
       <w:r>
         <w:rPr>
           <w:rStyle w:val="af2"/>
           <w:i w:val="0"/>
         </w:rPr>
-        <w:commentReference w:id="157"/>
+        <w:commentReference w:id="158"/>
       </w:r>
       <w:r>
         <w:rPr>
@@ -6378,7 +6362,7 @@
       <w:pPr>
         <w:pStyle w:val="a3"/>
       </w:pPr>
-      <w:ins w:id="159" w:author="Scientific Paper Revision Agent" w:date="2026-08-24T00:00:00Z">
+      <w:ins w:id="160" w:author="Scientific Paper Revision Agent" w:date="2026-08-24T00:00:00Z">
         <w:r>
           <w:t>Figure 10</w:t>
         </w:r>
@@ -6431,12 +6415,12 @@
       </w:r>
     </w:p>
     <w:p>
-      <w:commentRangeStart w:id="160"/>
       <w:commentRangeStart w:id="161"/>
+      <w:commentRangeStart w:id="162"/>
       <w:r>
         <w:t xml:space="preserve">The current schema encodes a subset of OWL 2 + SWRL expressiveness </w:t>
       </w:r>
-      <w:ins w:id="162" w:author="Scientific Paper Revision Agent" w:date="2026-08-24T00:00:00Z">
+      <w:ins w:id="163" w:author="Scientific Paper Revision Agent" w:date="2026-08-24T00:00:00Z">
         <w:r>
           <w:t>sufficient for quantitative threshold constraints — minimum, maximum, range, equality, cardinality — through the ClassAtom, DataPropertyAtom</w:t>
         </w:r>
@@ -6444,7 +6428,7 @@
       <w:r>
         <w:t xml:space="preserve">, </w:t>
       </w:r>
-      <w:ins w:id="163" w:author="Scientific Paper Revision Agent" w:date="2026-08-24T00:00:00Z">
+      <w:ins w:id="164" w:author="Scientific Paper Revision Agent" w:date="2026-08-24T00:00:00Z">
         <w:r>
           <w:t>ObjectPropertyAtom</w:t>
         </w:r>
@@ -6452,7 +6436,7 @@
       <w:r>
         <w:t>,</w:t>
       </w:r>
-      <w:ins w:id="164" w:author="Scientific Paper Revision Agent" w:date="2026-08-24T00:00:00Z">
+      <w:ins w:id="165" w:author="Scientific Paper Revision Agent" w:date="2026-08-24T00:00:00Z">
         <w:r>
           <w:t xml:space="preserve"> and BuiltinAtom types</w:t>
         </w:r>
@@ -6460,60 +6444,60 @@
       <w:r>
         <w:t>. It does not yet support disjunctive rules, complex class expressions, or temporal constraints, which are common in building energy codes and fire-safety regulations; extending the schema toward these patterns, most likely through a connector node type representing logical operators between atoms, is a priority for future work. The violation-pattern semantics also operates under an open-world assumption: if no building object is present in the graph, a height rule will not fire, irrespective of whether the constraint is satisfied — counterintuitive for practitioners expecting closed-world compliance semantics. The mitigation is twofold: the graph is pre-populated with all model objects before rule evaluation, so that the absence of a violation indicates compliance rather than an unpopulated graph, and the SHACL layer closes the world for structural completeness — a shape violation reports the missing population that would otherwise prevent a rule from firing.</w:t>
       </w:r>
-      <w:commentRangeEnd w:id="160"/>
+      <w:commentRangeEnd w:id="161"/>
       <w:r>
         <w:rPr>
           <w:rStyle w:val="af2"/>
         </w:rPr>
-        <w:commentReference w:id="160"/>
-      </w:r>
-      <w:commentRangeEnd w:id="161"/>
+        <w:commentReference w:id="161"/>
+      </w:r>
+      <w:commentRangeEnd w:id="162"/>
       <w:r>
         <w:rPr>
           <w:rStyle w:val="af2"/>
         </w:rPr>
-        <w:commentReference w:id="161"/>
-      </w:r>
-    </w:p>
-    <w:p>
-      <w:pPr>
-        <w:rPr>
-          <w:ins w:id="165" w:author="Scientific Paper Revision Agent" w:date="2026-08-24T00:00:00Z"/>
-        </w:rPr>
-      </w:pPr>
-      <w:ins w:id="166" w:author="Scientific Paper Revision Agent" w:date="2026-08-24T00:00:00Z">
+        <w:commentReference w:id="162"/>
+      </w:r>
+    </w:p>
+    <w:p>
+      <w:pPr>
+        <w:rPr>
+          <w:ins w:id="166" w:author="Scientific Paper Revision Agent" w:date="2026-08-24T00:00:00Z"/>
+        </w:rPr>
+      </w:pPr>
+      <w:ins w:id="167" w:author="Scientific Paper Revision Agent" w:date="2026-08-24T00:00:00Z">
         <w:r>
           <w:t xml:space="preserve">Three of the boundaries recorded in section 2.2 are open questions rather than settled limits. The first concerns generated vocabulary. Ontograph classes are minted per project from the terms a rule author uses, which keeps the schema free of a fixed spatial hierarchy but also allows two projects to name one concept twice. A default-class </w:t>
         </w:r>
-        <w:commentRangeStart w:id="167"/>
+        <w:commentRangeStart w:id="168"/>
         <w:r>
           <w:t>discipline</w:t>
         </w:r>
       </w:ins>
-      <w:commentRangeEnd w:id="167"/>
+      <w:commentRangeEnd w:id="168"/>
       <w:r>
         <w:rPr>
           <w:rStyle w:val="af2"/>
         </w:rPr>
-        <w:commentReference w:id="167"/>
-      </w:r>
-      <w:ins w:id="168" w:author="Scientific Paper Revision Agent" w:date="2026-08-24T00:00:00Z">
+        <w:commentReference w:id="168"/>
+      </w:r>
+      <w:ins w:id="169" w:author="Scientific Paper Revision Agent" w:date="2026-08-24T00:00:00Z">
         <w:r>
           <w:t xml:space="preserve"> would resolve a generated term against the aligned vocabularies first and mint a new class only where no candidate matches it semantically, so that reuse accumulates across projects rather than being re-declared in each. The second follows from the first. IFC is the agreed open format for cross-platform exchange, and an IfcOWL alignment would let generated classes resolve against IFC entities under the same resolve-then-mint </w:t>
         </w:r>
-        <w:commentRangeStart w:id="169"/>
+        <w:commentRangeStart w:id="170"/>
         <w:r>
           <w:t xml:space="preserve">discipline </w:t>
         </w:r>
       </w:ins>
-      <w:commentRangeEnd w:id="169"/>
+      <w:commentRangeEnd w:id="170"/>
       <w:r>
         <w:rPr>
           <w:rStyle w:val="af2"/>
         </w:rPr>
-        <w:commentReference w:id="169"/>
-      </w:r>
-      <w:ins w:id="170" w:author="Scientific Paper Revision Agent" w:date="2026-08-24T00:00:00Z">
+        <w:commentReference w:id="170"/>
+      </w:r>
+      <w:ins w:id="171" w:author="Scientific Paper Revision Agent" w:date="2026-08-24T00:00:00Z">
         <w:r>
           <w:t xml:space="preserve">that the topology alignment already expresses, giving the schema a route to exchange without binding its core to one format. The third concerns movement. The situated extension of FBS (Gero &amp; Kannengiesser, 2004) treats designing as movement between state spaces, and section 3.3 has established what the schema holds at each moment: a Design State resolves Function, Behaviour and Structure. Typing the movement between two such states asks one further thing of the schema — the design space each state belongs to. States accumulate in partitions as much as in succession: one set may hold facade alternatives while another </w:t>
         </w:r>
@@ -6532,21 +6516,21 @@
           <w:numId w:val="0"/>
         </w:numPr>
       </w:pPr>
-      <w:commentRangeStart w:id="171"/>
+      <w:commentRangeStart w:id="172"/>
       <w:r>
         <w:t>6.2 Positioning and scalability</w:t>
       </w:r>
-      <w:commentRangeEnd w:id="171"/>
+      <w:commentRangeEnd w:id="172"/>
       <w:r>
         <w:rPr>
           <w:rStyle w:val="af2"/>
           <w:b w:val="0"/>
         </w:rPr>
-        <w:commentReference w:id="171"/>
-      </w:r>
-    </w:p>
-    <w:p>
-      <w:ins w:id="172" w:author="Scientific Paper Revision Agent" w:date="2026-08-24T00:00:00Z">
+        <w:commentReference w:id="172"/>
+      </w:r>
+    </w:p>
+    <w:p>
+      <w:ins w:id="173" w:author="Scientific Paper Revision Agent" w:date="2026-08-24T00:00:00Z">
         <w:r>
           <w:t>Table 7</w:t>
         </w:r>
@@ -7099,7 +7083,7 @@
         <w:pStyle w:val="a3"/>
         <w:jc w:val="center"/>
       </w:pPr>
-      <w:ins w:id="173" w:author="Scientific Paper Revision Agent" w:date="2026-08-24T00:00:00Z">
+      <w:ins w:id="174" w:author="Scientific Paper Revision Agent" w:date="2026-08-24T00:00:00Z">
         <w:r>
           <w:t>Table 7</w:t>
         </w:r>
@@ -7129,7 +7113,7 @@
       <w:r>
         <w:t>Regarding scalability, project isolation via a property filter within a single graph suits the pilot scale defined in section 3.2 but should be revisited for multi-tenant settings, where sharding or per-project databases may be preferable; city-scale models and national regulatory libraries will additionally require query-indexing strategies.</w:t>
       </w:r>
-      <w:del w:id="174" w:author="Scientific Paper Revision Agent" w:date="2026-08-24T00:00:00Z">
+      <w:del w:id="175" w:author="Scientific Paper Revision Agent" w:date="2026-08-24T00:00:00Z">
         <w:r>
           <w:delText xml:space="preserve"> </w:delText>
         </w:r>
@@ -7170,13 +7154,13 @@
         <w:lastRenderedPageBreak/>
         <w:t>explicit population discipline.</w:t>
       </w:r>
-      <w:commentRangeStart w:id="175"/>
-      <w:commentRangeEnd w:id="175"/>
+      <w:commentRangeStart w:id="176"/>
+      <w:commentRangeEnd w:id="176"/>
       <w:r>
         <w:rPr>
           <w:rStyle w:val="af2"/>
         </w:rPr>
-        <w:commentReference w:id="175"/>
+        <w:commentReference w:id="176"/>
       </w:r>
       <w:r>
         <w:t xml:space="preserve"> </w:t>
@@ -7188,7 +7172,7 @@
         </w:rPr>
         <w:t xml:space="preserve">All four of the paper's competency questions are answered directly </w:t>
       </w:r>
-      <w:commentRangeStart w:id="176"/>
+      <w:commentRangeStart w:id="177"/>
       <w:r>
         <w:rPr>
           <w:iCs/>
@@ -7196,30 +7180,30 @@
         </w:rPr>
         <w:t>against the running graph (section 5).</w:t>
       </w:r>
-      <w:commentRangeEnd w:id="176"/>
-      <w:r>
-        <w:commentReference w:id="176"/>
-      </w:r>
-    </w:p>
-    <w:p>
-      <w:commentRangeStart w:id="177"/>
+      <w:commentRangeEnd w:id="177"/>
+      <w:r>
+        <w:commentReference w:id="177"/>
+      </w:r>
+    </w:p>
+    <w:p>
       <w:commentRangeStart w:id="178"/>
+      <w:commentRangeStart w:id="179"/>
       <w:r>
         <w:t>The schema inherits the three-way Function–Behaviour–Structure decomposition (Gero, 1990), retaining Behaviour and Structure on the Object and externalising Function into the knowledge graph, where it is addressable independently of the artefact it governs. The object-centred core holds that decomposition, the property-graph-to-OWL projection keeps it machine-checked for consistency, and the identity-carrier mechanism carries an object's semantic properties across a platform change.</w:t>
       </w:r>
-      <w:commentRangeEnd w:id="177"/>
+      <w:commentRangeEnd w:id="178"/>
       <w:r>
         <w:rPr>
           <w:rStyle w:val="af2"/>
         </w:rPr>
-        <w:commentReference w:id="177"/>
-      </w:r>
-      <w:commentRangeEnd w:id="178"/>
+        <w:commentReference w:id="178"/>
+      </w:r>
+      <w:commentRangeEnd w:id="179"/>
       <w:r>
         <w:rPr>
           <w:rStyle w:val="af2"/>
         </w:rPr>
-        <w:commentReference w:id="178"/>
+        <w:commentReference w:id="179"/>
       </w:r>
     </w:p>
     <w:p>
@@ -7243,16 +7227,16 @@
       <w:r>
         <w:t xml:space="preserve">(2) extend the rule schema to disjunctive and temporal constraints, which the current </w:t>
       </w:r>
-      <w:commentRangeStart w:id="179"/>
+      <w:commentRangeStart w:id="180"/>
       <w:r>
         <w:t xml:space="preserve">three-atom-type </w:t>
       </w:r>
-      <w:commentRangeEnd w:id="179"/>
+      <w:commentRangeEnd w:id="180"/>
       <w:r>
         <w:rPr>
           <w:rStyle w:val="af2"/>
         </w:rPr>
-        <w:commentReference w:id="179"/>
+        <w:commentReference w:id="180"/>
       </w:r>
       <w:r>
         <w:t>encoding does not support (section 6.1); (3) deepen the standards bridges toward full topological reasoning and requirement-driven exchange workflows (IfcOWL/IDS). The ontology, its extension modules, and the supporting artifacts will be released as open source under the terms stated below, to support community adoption and comparative evaluation.</w:t>
@@ -7274,7 +7258,7 @@
       <w:r>
         <w:t xml:space="preserve">The core ontology module, its three extension modules (standards, BOT, Topologic), the SHACL shape set, and the normative property-graph-to-OWL mapping documentation described in this paper are maintained as a versioned project and will be deposited at an open, citable archive with an assigned DOI and an explicit open licence upon acceptance; the namespace currently in use (http://example.org/design-grammar#) is a development placeholder and will be replaced by a resolving, permanent namespace at the same time, consistent with linked-data best practice. The deposit comprises the core ontology module and its catalogue; the three extension modules for the standards stack, building topology, and non-manifold topology; the SHACL shape set and the curated disjointness overlay; the normative property-graph-to-OWL mapping specification; the graph schema specification and the rule-partition policy; the catalogue of rule shapes that drives LLM rule encoding (section 4); the cross-platform identity specification (section 4); and the schema migration scripts. </w:t>
       </w:r>
-      <w:ins w:id="180" w:author="Scientific Paper Revision Agent" w:date="2026-08-24T00:00:00Z">
+      <w:ins w:id="181" w:author="Scientific Paper Revision Agent" w:date="2026-08-24T00:00:00Z">
         <w:r>
           <w:t xml:space="preserve">The element counts of Table </w:t>
         </w:r>
@@ -7291,17 +7275,9 @@
       <w:r>
         <w:t xml:space="preserve"> </w:t>
       </w:r>
-      <w:ins w:id="181" w:author="Scientific Paper Revision Agent" w:date="2026-08-24T00:00:00Z">
+      <w:ins w:id="182" w:author="Scientific Paper Revision Agent" w:date="2026-08-24T00:00:00Z">
         <w:r>
           <w:t>The runtime services that exercise the schema — the graph data service, the reasoner sidecar, and the Grasshopper authoring plugin — are versioned in the same deposit (Ermolenko, 2026). The ontology modules, the shape set and the specifications are released under the Creative Commons Attribution 4.0 International licence, and the runtime services, the rule-shape catalogue and the migration scripts under the Apache License 2.0.</w:t>
-        </w:r>
-      </w:ins>
-      <w:r>
-        <w:t xml:space="preserve"/>
-      </w:r>
-      <w:ins w:id="182" w:author="Scientific Paper Revision Agent" w:date="2026-08-24T00:00:00Z">
-        <w:r>
-          <w:t/>
         </w:r>
       </w:ins>
     </w:p>
@@ -7484,11 +7460,8 @@
         </w:rPr>
       </w:pPr>
       <w:r>
-        <w:t xml:space="preserve">Cheung, L. H., Lombardi, D., &amp; Di Marco, G. (2025). Agentic, multimodal large language model (LLM) with </w:t>
-      </w:r>
-      <w:r>
         <w:lastRenderedPageBreak/>
-        <w:t xml:space="preserve">behavioural parameters and self-iterative capabilities for conversational architectural design processes. </w:t>
+        <w:t xml:space="preserve">Cheung, L. H., Lombardi, D., &amp; Di Marco, G. (2025). Agentic, multimodal large language model (LLM) with behavioural parameters and self-iterative capabilities for conversational architectural design processes. </w:t>
       </w:r>
       <w:r>
         <w:rPr>
@@ -7597,7 +7570,10 @@
         <w:t>Design Grammar ontology</w:t>
       </w:r>
       <w:r>
-        <w:t xml:space="preserve"> (Version 1.0.1) [Computer software]. GitHub. https://github.com/Erarchitech/design-grammar-ontology</w:t>
+        <w:t xml:space="preserve"> (Version 1.0.1) [Computer software]. GitHub. https://github.com/Erarchitech/design-g</w:t>
+      </w:r>
+      <w:r>
+        <w:t>rammar-ontology</w:t>
       </w:r>
     </w:p>
     <w:p>
@@ -7872,6 +7848,7 @@
         </w:rPr>
       </w:pPr>
       <w:r>
+        <w:lastRenderedPageBreak/>
         <w:t xml:space="preserve">Lin, C.-J. (2016). Design criteria modeling — Use of ontology-based algorithmic modeling to represent architectural design criteria at the conceptual design stage. </w:t>
       </w:r>
       <w:r>
@@ -7892,345 +7869,348 @@
         </w:rPr>
       </w:pPr>
       <w:r>
+        <w:t xml:space="preserve">Madireddy, S., Gao, L., Din, Z. U., Kim, K., Senouci, A., Han, Z., &amp; Zhang, Y. (2025). Large language model-driven code compliance checking in building information modeling. </w:t>
+      </w:r>
+      <w:r>
+        <w:rPr>
+          <w:i/>
+        </w:rPr>
+        <w:t>Electronics, 14</w:t>
+      </w:r>
+      <w:r>
+        <w:t>(11), 2146. https://doi.org/10.3390/electronics14112146</w:t>
+      </w:r>
+    </w:p>
+    <w:p>
+      <w:pPr>
+        <w:pStyle w:val="Reference"/>
+        <w:rPr>
+          <w:lang w:val="en-US"/>
+        </w:rPr>
+      </w:pPr>
+      <w:r>
+        <w:t xml:space="preserve">Mubarak, K. (2004). </w:t>
+      </w:r>
+      <w:r>
+        <w:rPr>
+          <w:i/>
+        </w:rPr>
+        <w:t>Case-based reasoning for design composition in architecture</w:t>
+      </w:r>
+      <w:r>
+        <w:t xml:space="preserve"> [Doctoral dissertation, Carnegie Mellon University].</w:t>
+      </w:r>
+    </w:p>
+    <w:p>
+      <w:pPr>
+        <w:pStyle w:val="Reference"/>
+        <w:rPr>
+          <w:lang w:val="en-US"/>
+        </w:rPr>
+      </w:pPr>
+      <w:r>
+        <w:t xml:space="preserve">Noy, N. F., &amp; McGuinness, D. L. (2001). </w:t>
+      </w:r>
+      <w:r>
+        <w:rPr>
+          <w:i/>
+        </w:rPr>
+        <w:t>Ontology development 101: A guide to creating your first ontology</w:t>
+      </w:r>
+      <w:r>
+        <w:t>. Stanford Knowledge Systems Laboratory Technical Report KSL-01-05.</w:t>
+      </w:r>
+    </w:p>
+    <w:p>
+      <w:pPr>
+        <w:pStyle w:val="Reference"/>
+        <w:rPr>
+          <w:lang w:val="en-US"/>
+        </w:rPr>
+      </w:pPr>
+      <w:r>
+        <w:t xml:space="preserve">Palihakkara, A. D., Osorio-Sandoval, C. A., &amp; Tizani, W. (2025). A review of the application of ontologies and semantic web for building information modelling and digital twins based construction management. </w:t>
+      </w:r>
+      <w:r>
+        <w:rPr>
+          <w:i/>
+        </w:rPr>
+        <w:t>Journal of Information Technology in Construction (ITcon), 30</w:t>
+      </w:r>
+      <w:r>
+        <w:t>, 1208–1243. https://doi.org/10.36680/j.itcon.2025.049</w:t>
+      </w:r>
+    </w:p>
+    <w:p>
+      <w:pPr>
+        <w:pStyle w:val="Reference"/>
+        <w:rPr>
+          <w:lang w:val="en-US"/>
+        </w:rPr>
+      </w:pPr>
+      <w:r>
+        <w:t xml:space="preserve">Pauwels, P., &amp; Terkaj, W. (2016). EXPRESS to OWL for construction industry: Towards a recommendable and usable ifcOWL ontology. </w:t>
+      </w:r>
+      <w:r>
+        <w:rPr>
+          <w:i/>
+        </w:rPr>
+        <w:t>Automation in Construction, 63</w:t>
+      </w:r>
+      <w:r>
+        <w:t>, 100–133. https://doi.org/10.1016/j.autcon.2015.12.003</w:t>
+      </w:r>
+    </w:p>
+    <w:p>
+      <w:pPr>
+        <w:pStyle w:val="Reference"/>
+        <w:rPr>
+          <w:lang w:val="en-US"/>
+        </w:rPr>
+      </w:pPr>
+      <w:r>
+        <w:t xml:space="preserve">Pauwels, P., Zhang, S., &amp; Lee, Y. C. (2017). Semantic web technologies in AEC industry: A literature overview. </w:t>
+      </w:r>
+      <w:r>
+        <w:rPr>
+          <w:i/>
+        </w:rPr>
+        <w:t>Automation in Construction, 83</w:t>
+      </w:r>
+      <w:r>
+        <w:t>, 145–165. https://doi.org/10.1016/j.autcon.2017.03.009</w:t>
+      </w:r>
+    </w:p>
+    <w:p>
+      <w:pPr>
+        <w:pStyle w:val="Reference"/>
+      </w:pPr>
+      <w:r>
+        <w:t xml:space="preserve">Poon, J., &amp; Maher, M. L. (1997). Co-evolution and emergence in design. </w:t>
+      </w:r>
+      <w:r>
+        <w:rPr>
+          <w:i/>
+        </w:rPr>
+        <w:t>Artificial Intelligence in Engineering, 11</w:t>
+      </w:r>
+      <w:r>
+        <w:t>(3), 319–327. https://doi.org/10.1016/S0954-1810(96)00047-7</w:t>
+      </w:r>
+    </w:p>
+    <w:p>
+      <w:pPr>
+        <w:pStyle w:val="Reference"/>
+      </w:pPr>
+      <w:r>
+        <w:t xml:space="preserve">Poveda-Villalón, M., Fernández-Izquierdo, A., Fernández-López, M., &amp; García-Castro, R. (2022). LOT: An industrial oriented ontology engineering framework. </w:t>
+      </w:r>
+      <w:r>
+        <w:rPr>
+          <w:i/>
+        </w:rPr>
+        <w:t>Engineering Applications of Artificial Intelligence, 111</w:t>
+      </w:r>
+      <w:r>
+        <w:t>, 104755. https://doi.org/10.1016/j.engappai.2022.104755</w:t>
+      </w:r>
+    </w:p>
+    <w:p>
+      <w:pPr>
+        <w:pStyle w:val="Reference"/>
+      </w:pPr>
+      <w:r>
+        <w:t xml:space="preserve">Poveda-Villalón, M., Gómez-Pérez, A., &amp; Suárez-Figueroa, M. C. (2014). OOPS! (OntOlogy Pitfall Scanner!): An on-line tool for ontology evaluation. </w:t>
+      </w:r>
+      <w:r>
+        <w:rPr>
+          <w:i/>
+        </w:rPr>
+        <w:t>International Journal on Semantic Web and Information Systems, 10</w:t>
+      </w:r>
+      <w:r>
+        <w:t>(2), 7–34. https://doi.org/10.4018/ijswis.2014040102</w:t>
+      </w:r>
+    </w:p>
+    <w:p>
+      <w:pPr>
+        <w:pStyle w:val="Reference"/>
+        <w:rPr>
+          <w:lang w:val="en-US"/>
+        </w:rPr>
+      </w:pPr>
+      <w:r>
+        <w:t xml:space="preserve">Rasmussen, M. H., Lefrançois, M., Schneider, G. F., &amp; Pauwels, P. (2020). BOT: The building topology ontology of the W3C linked building data community group. </w:t>
+      </w:r>
+      <w:r>
+        <w:rPr>
+          <w:i/>
+        </w:rPr>
+        <w:t>Semantic Web, 12</w:t>
+      </w:r>
+      <w:r>
+        <w:t>(1), 143–161. https://doi.org/10.3233/SW-200385</w:t>
+      </w:r>
+    </w:p>
+    <w:p>
+      <w:pPr>
+        <w:pStyle w:val="Reference"/>
+        <w:rPr>
+          <w:lang w:val="en-US"/>
+        </w:rPr>
+      </w:pPr>
+      <w:r>
+        <w:t xml:space="preserve">RIBA. (2020). </w:t>
+      </w:r>
+      <w:r>
+        <w:rPr>
+          <w:i/>
+        </w:rPr>
+        <w:t>RIBA Plan of Work 2020 overview</w:t>
+      </w:r>
+      <w:r>
+        <w:t>. Royal Institute of British Architects.</w:t>
+      </w:r>
+    </w:p>
+    <w:p>
+      <w:pPr>
+        <w:pStyle w:val="Reference"/>
+        <w:rPr>
+          <w:lang w:val="en-US"/>
+        </w:rPr>
+      </w:pPr>
+      <w:r>
+        <w:t xml:space="preserve">Sack, H. (2019). </w:t>
+      </w:r>
+      <w:r>
+        <w:rPr>
+          <w:i/>
+        </w:rPr>
+        <w:t>Knowledge engineering with semantic web technologies: Ontological engineering</w:t>
+      </w:r>
+      <w:r>
+        <w:t xml:space="preserve"> [MOOC]. openHPI.</w:t>
+      </w:r>
+    </w:p>
+    <w:p>
+      <w:pPr>
+        <w:pStyle w:val="Reference"/>
+        <w:rPr>
+          <w:lang w:val="en-US"/>
+        </w:rPr>
+      </w:pPr>
+      <w:r>
+        <w:t xml:space="preserve">Sacks, R., Brilakis, I., Pikas, E., Xie, H. S., &amp; Girolami, M. (2020). Construction with digital twin information systems. </w:t>
+      </w:r>
+      <w:r>
+        <w:rPr>
+          <w:i/>
+        </w:rPr>
+        <w:t>Data-Centric Engineering, 1</w:t>
+      </w:r>
+      <w:r>
+        <w:t>, e14. https://doi.org/10.1017/dce.2020.16</w:t>
+      </w:r>
+    </w:p>
+    <w:p>
+      <w:pPr>
+        <w:pStyle w:val="Reference"/>
+        <w:rPr>
+          <w:lang w:val="en-US"/>
+        </w:rPr>
+      </w:pPr>
+      <w:r>
+        <w:t xml:space="preserve">Schön, D. A. (1992). Designing as reflective conversation with the materials of a design situation. </w:t>
+      </w:r>
+      <w:r>
+        <w:rPr>
+          <w:i/>
+        </w:rPr>
+        <w:t>Research in Engineering Design, 3</w:t>
+      </w:r>
+      <w:r>
+        <w:t>(3), 131–147. https://doi.org/10.1007/BF01580516</w:t>
+      </w:r>
+    </w:p>
+    <w:p>
+      <w:pPr>
+        <w:pStyle w:val="Reference"/>
+        <w:rPr>
+          <w:lang w:val="en-US"/>
+        </w:rPr>
+      </w:pPr>
+      <w:r>
+        <w:t xml:space="preserve">Stiny, G., &amp; Gips, J. (1972). Shape grammars and the generative specification of painting and sculpture. In C. V. Freiman (Ed.), </w:t>
+      </w:r>
+      <w:r>
+        <w:rPr>
+          <w:i/>
+        </w:rPr>
+        <w:t>Information Processing 71</w:t>
+      </w:r>
+      <w:r>
+        <w:t xml:space="preserve"> (pp. 1460–1465). North-Holland.</w:t>
+      </w:r>
+    </w:p>
+    <w:p>
+      <w:pPr>
+        <w:pStyle w:val="Reference"/>
+      </w:pPr>
+      <w:r>
+        <w:t xml:space="preserve">Suárez-Figueroa, M. C., Gómez-Pérez, A., &amp; Fernández-López, M. (2015). The NeOn methodology for ontology engineering. In M. C. Suárez-Figueroa, A. Gómez-Pérez, E. Motta, &amp; A. Gangemi (Eds.), </w:t>
+      </w:r>
+      <w:r>
+        <w:rPr>
+          <w:i/>
+        </w:rPr>
+        <w:t>Ontology engineering in a networked world</w:t>
+      </w:r>
+      <w:r>
+        <w:t xml:space="preserve"> (pp. 9–34). Springer. https://doi.org/10.1007/978-3-642-24794-1_2</w:t>
+      </w:r>
+    </w:p>
+    <w:p>
+      <w:pPr>
+        <w:pStyle w:val="Reference"/>
+        <w:rPr>
+          <w:lang w:val="en-US"/>
+        </w:rPr>
+      </w:pPr>
+      <w:r>
+        <w:t xml:space="preserve">Wyke, S., &amp; Lindhard, S. M. (2025). Understanding design rationale and intent through natural language processing analysis: A search for consensus. </w:t>
+      </w:r>
+      <w:r>
+        <w:rPr>
+          <w:i/>
+        </w:rPr>
+        <w:t>Journal of Information Technology in Construction (ITcon), 30</w:t>
+      </w:r>
+      <w:r>
+        <w:t>, 631–649. https://doi.org/10.36680/j.itcon.2025.026</w:t>
+      </w:r>
+    </w:p>
+    <w:p>
+      <w:pPr>
+        <w:pStyle w:val="Reference"/>
+        <w:rPr>
+          <w:lang w:val="en-US"/>
+        </w:rPr>
+      </w:pPr>
+      <w:r>
+        <w:t xml:space="preserve">Zhou, Y., Braun, A., &amp; Borrmann, A. (2022). Knowledge graph-based automated code compliance checking for building design. In </w:t>
+      </w:r>
+      <w:r>
+        <w:rPr>
+          <w:i/>
+        </w:rPr>
+        <w:t>Proceedings of the European Conference on Computing in Construction (EC3)</w:t>
+      </w:r>
+      <w:r>
+        <w:t xml:space="preserve">. </w:t>
+      </w:r>
+      <w:r>
         <w:lastRenderedPageBreak/>
-        <w:t xml:space="preserve">Madireddy, S., Gao, L., Din, Z. U., Kim, K., Senouci, A., Han, Z., &amp; Zhang, Y. (2025). Large language model-driven code compliance checking in building information modeling. </w:t>
-      </w:r>
-      <w:r>
-        <w:rPr>
-          <w:i/>
-        </w:rPr>
-        <w:t>Electronics, 14</w:t>
-      </w:r>
-      <w:r>
-        <w:t>(11), 2146. https://doi.org/10.3390/electronics14112146</w:t>
-      </w:r>
-    </w:p>
-    <w:p>
-      <w:pPr>
-        <w:pStyle w:val="Reference"/>
-        <w:rPr>
-          <w:lang w:val="en-US"/>
-        </w:rPr>
-      </w:pPr>
-      <w:r>
-        <w:t xml:space="preserve">Mubarak, K. (2004). </w:t>
-      </w:r>
-      <w:r>
-        <w:rPr>
-          <w:i/>
-        </w:rPr>
-        <w:t>Case-based reasoning for design composition in architecture</w:t>
-      </w:r>
-      <w:r>
-        <w:t xml:space="preserve"> [Doctoral dissertation, Carnegie Mellon University].</w:t>
-      </w:r>
-    </w:p>
-    <w:p>
-      <w:pPr>
-        <w:pStyle w:val="Reference"/>
-        <w:rPr>
-          <w:lang w:val="en-US"/>
-        </w:rPr>
-      </w:pPr>
-      <w:r>
-        <w:t xml:space="preserve">Noy, N. F., &amp; McGuinness, D. L. (2001). </w:t>
-      </w:r>
-      <w:r>
-        <w:rPr>
-          <w:i/>
-        </w:rPr>
-        <w:t>Ontology development 101: A guide to creating your first ontology</w:t>
-      </w:r>
-      <w:r>
-        <w:t>. Stanford Knowledge Systems Laboratory Technical Report KSL-01-05.</w:t>
-      </w:r>
-    </w:p>
-    <w:p>
-      <w:pPr>
-        <w:pStyle w:val="Reference"/>
-        <w:rPr>
-          <w:lang w:val="en-US"/>
-        </w:rPr>
-      </w:pPr>
-      <w:r>
-        <w:t xml:space="preserve">Palihakkara, A. D., Osorio-Sandoval, C. A., &amp; Tizani, W. (2025). A review of the application of ontologies and semantic web for building information modelling and digital twins based construction management. </w:t>
-      </w:r>
-      <w:r>
-        <w:rPr>
-          <w:i/>
-        </w:rPr>
-        <w:t>Journal of Information Technology in Construction (ITcon), 30</w:t>
-      </w:r>
-      <w:r>
-        <w:t>, 1208–1243. https://doi.org/10.36680/j.itcon.2025.049</w:t>
-      </w:r>
-    </w:p>
-    <w:p>
-      <w:pPr>
-        <w:pStyle w:val="Reference"/>
-        <w:rPr>
-          <w:lang w:val="en-US"/>
-        </w:rPr>
-      </w:pPr>
-      <w:r>
-        <w:t xml:space="preserve">Pauwels, P., &amp; Terkaj, W. (2016). EXPRESS to OWL for construction industry: Towards a recommendable and usable ifcOWL ontology. </w:t>
-      </w:r>
-      <w:r>
-        <w:rPr>
-          <w:i/>
-        </w:rPr>
-        <w:t>Automation in Construction, 63</w:t>
-      </w:r>
-      <w:r>
-        <w:t>, 100–133. https://doi.org/10.1016/j.autcon.2015.12.003</w:t>
-      </w:r>
-    </w:p>
-    <w:p>
-      <w:pPr>
-        <w:pStyle w:val="Reference"/>
-        <w:rPr>
-          <w:lang w:val="en-US"/>
-        </w:rPr>
-      </w:pPr>
-      <w:r>
-        <w:t xml:space="preserve">Pauwels, P., Zhang, S., &amp; Lee, Y. C. (2017). Semantic web technologies in AEC industry: A literature overview. </w:t>
-      </w:r>
-      <w:r>
-        <w:rPr>
-          <w:i/>
-        </w:rPr>
-        <w:t>Automation in Construction, 83</w:t>
-      </w:r>
-      <w:r>
-        <w:t>, 145–165. https://doi.org/10.1016/j.autcon.2017.03.009</w:t>
-      </w:r>
-    </w:p>
-    <w:p>
-      <w:pPr>
-        <w:pStyle w:val="Reference"/>
-      </w:pPr>
-      <w:r>
-        <w:t xml:space="preserve">Poon, J., &amp; Maher, M. L. (1997). Co-evolution and emergence in design. </w:t>
-      </w:r>
-      <w:r>
-        <w:rPr>
-          <w:i/>
-        </w:rPr>
-        <w:t>Artificial Intelligence in Engineering, 11</w:t>
-      </w:r>
-      <w:r>
-        <w:t>(3), 319–327. https://doi.org/10.1016/S0954-1810(96)00047-7</w:t>
-      </w:r>
-    </w:p>
-    <w:p>
-      <w:pPr>
-        <w:pStyle w:val="Reference"/>
-      </w:pPr>
-      <w:r>
-        <w:t xml:space="preserve">Poveda-Villalón, M., Fernández-Izquierdo, A., Fernández-López, M., &amp; García-Castro, R. (2022). LOT: An industrial oriented ontology engineering framework. </w:t>
-      </w:r>
-      <w:r>
-        <w:rPr>
-          <w:i/>
-        </w:rPr>
-        <w:t>Engineering Applications of Artificial Intelligence, 111</w:t>
-      </w:r>
-      <w:r>
-        <w:t>, 104755. https://doi.org/10.1016/j.engappai.2022.104755</w:t>
-      </w:r>
-    </w:p>
-    <w:p>
-      <w:pPr>
-        <w:pStyle w:val="Reference"/>
-      </w:pPr>
-      <w:r>
-        <w:t xml:space="preserve">Poveda-Villalón, M., Gómez-Pérez, A., &amp; Suárez-Figueroa, M. C. (2014). OOPS! (OntOlogy Pitfall Scanner!): An on-line tool for ontology evaluation. </w:t>
-      </w:r>
-      <w:r>
-        <w:rPr>
-          <w:i/>
-        </w:rPr>
-        <w:t>International Journal on Semantic Web and Information Systems, 10</w:t>
-      </w:r>
-      <w:r>
-        <w:t>(2), 7–34. https://doi.org/10.4018/ijswis.2014040102</w:t>
-      </w:r>
-    </w:p>
-    <w:p>
-      <w:pPr>
-        <w:pStyle w:val="Reference"/>
-        <w:rPr>
-          <w:lang w:val="en-US"/>
-        </w:rPr>
-      </w:pPr>
-      <w:r>
-        <w:t xml:space="preserve">Rasmussen, M. H., Lefrançois, M., Schneider, G. F., &amp; Pauwels, P. (2020). BOT: The building topology ontology of the W3C linked building data community group. </w:t>
-      </w:r>
-      <w:r>
-        <w:rPr>
-          <w:i/>
-        </w:rPr>
-        <w:t>Semantic Web, 12</w:t>
-      </w:r>
-      <w:r>
-        <w:t>(1), 143–161. https://doi.org/10.3233/SW-200385</w:t>
-      </w:r>
-    </w:p>
-    <w:p>
-      <w:pPr>
-        <w:pStyle w:val="Reference"/>
-        <w:rPr>
-          <w:lang w:val="en-US"/>
-        </w:rPr>
-      </w:pPr>
-      <w:r>
-        <w:t xml:space="preserve">RIBA. (2020). </w:t>
-      </w:r>
-      <w:r>
-        <w:rPr>
-          <w:i/>
-        </w:rPr>
-        <w:t>RIBA Plan of Work 2020 overview</w:t>
-      </w:r>
-      <w:r>
-        <w:t>. Royal Institute of British Architects.</w:t>
-      </w:r>
-    </w:p>
-    <w:p>
-      <w:pPr>
-        <w:pStyle w:val="Reference"/>
-        <w:rPr>
-          <w:lang w:val="en-US"/>
-        </w:rPr>
-      </w:pPr>
-      <w:r>
-        <w:t xml:space="preserve">Sack, H. (2019). </w:t>
-      </w:r>
-      <w:r>
-        <w:rPr>
-          <w:i/>
-        </w:rPr>
-        <w:t>Knowledge engineering with semantic web technologies: Ontological engineering</w:t>
-      </w:r>
-      <w:r>
-        <w:t xml:space="preserve"> [MOOC]. openHPI.</w:t>
-      </w:r>
-    </w:p>
-    <w:p>
-      <w:pPr>
-        <w:pStyle w:val="Reference"/>
-        <w:rPr>
-          <w:lang w:val="en-US"/>
-        </w:rPr>
-      </w:pPr>
-      <w:r>
-        <w:t xml:space="preserve">Sacks, R., Brilakis, I., Pikas, E., Xie, H. S., &amp; Girolami, M. (2020). Construction with digital twin information systems. </w:t>
-      </w:r>
-      <w:r>
-        <w:rPr>
-          <w:i/>
-        </w:rPr>
-        <w:t>Data-Centric Engineering, 1</w:t>
-      </w:r>
-      <w:r>
-        <w:t>, e14. https://doi.org/10.1017/dce.2020.16</w:t>
-      </w:r>
-    </w:p>
-    <w:p>
-      <w:pPr>
-        <w:pStyle w:val="Reference"/>
-        <w:rPr>
-          <w:lang w:val="en-US"/>
-        </w:rPr>
-      </w:pPr>
-      <w:r>
-        <w:t xml:space="preserve">Schön, D. A. (1992). Designing as reflective conversation with the materials of a design situation. </w:t>
-      </w:r>
-      <w:r>
-        <w:rPr>
-          <w:i/>
-        </w:rPr>
-        <w:t>Research in Engineering Design, 3</w:t>
-      </w:r>
-      <w:r>
-        <w:t>(3), 131–147. https://doi.org/10.1007/BF01580516</w:t>
-      </w:r>
-    </w:p>
-    <w:p>
-      <w:pPr>
-        <w:pStyle w:val="Reference"/>
-        <w:rPr>
-          <w:lang w:val="en-US"/>
-        </w:rPr>
-      </w:pPr>
-      <w:r>
-        <w:t xml:space="preserve">Stiny, G., &amp; Gips, J. (1972). Shape grammars and the generative specification of painting and sculpture. In C. V. Freiman (Ed.), </w:t>
-      </w:r>
-      <w:r>
-        <w:rPr>
-          <w:i/>
-        </w:rPr>
-        <w:t>Information Processing 71</w:t>
-      </w:r>
-      <w:r>
-        <w:t xml:space="preserve"> (pp. 1460–1465). North-Holland.</w:t>
-      </w:r>
-    </w:p>
-    <w:p>
-      <w:pPr>
-        <w:pStyle w:val="Reference"/>
-      </w:pPr>
-      <w:r>
-        <w:t xml:space="preserve">Suárez-Figueroa, M. C., Gómez-Pérez, A., &amp; Fernández-López, M. (2015). The NeOn methodology for ontology engineering. In M. C. Suárez-Figueroa, A. Gómez-Pérez, E. Motta, &amp; A. Gangemi (Eds.), </w:t>
-      </w:r>
-      <w:r>
-        <w:rPr>
-          <w:i/>
-        </w:rPr>
-        <w:t>Ontology engineering in a networked world</w:t>
-      </w:r>
-      <w:r>
-        <w:t xml:space="preserve"> (pp. 9–34). Springer. https://doi.org/10.1007/978-3-642-24794-1_2</w:t>
-      </w:r>
-    </w:p>
-    <w:p>
-      <w:pPr>
-        <w:pStyle w:val="Reference"/>
-        <w:rPr>
-          <w:lang w:val="en-US"/>
-        </w:rPr>
-      </w:pPr>
-      <w:r>
-        <w:t xml:space="preserve">Wyke, S., &amp; Lindhard, S. M. (2025). Understanding design rationale and intent through natural language processing analysis: A search for consensus. </w:t>
-      </w:r>
-      <w:r>
-        <w:rPr>
-          <w:i/>
-        </w:rPr>
-        <w:t>Journal of Information Technology in Construction (ITcon), 30</w:t>
-      </w:r>
-      <w:r>
-        <w:t>, 631–649. https://doi.org/10.36680/j.itcon.2025.026</w:t>
-      </w:r>
-    </w:p>
-    <w:p>
-      <w:pPr>
-        <w:pStyle w:val="Reference"/>
-        <w:rPr>
-          <w:lang w:val="en-US"/>
-        </w:rPr>
-      </w:pPr>
-      <w:r>
-        <w:t xml:space="preserve">Zhou, Y., Braun, A., &amp; Borrmann, A. (2022). Knowledge graph-based automated code compliance checking for building design. In </w:t>
-      </w:r>
-      <w:r>
-        <w:rPr>
-          <w:i/>
-        </w:rPr>
-        <w:t>Proceedings of the European Conference on Computing in Construction (EC3)</w:t>
-      </w:r>
-      <w:r>
-        <w:t>. https://doi.org/10.35490/EC3.2022.188</w:t>
+        <w:t>https://doi.org/10.35490/EC3.2022.188</w:t>
       </w:r>
     </w:p>
     <w:p>
@@ -8266,7 +8246,6 @@
       </w:pPr>
       <w:ins w:id="189" w:author="Scientific Paper Revision Agent" w:date="2026-08-24T00:00:00Z">
         <w:r>
-          <w:lastRenderedPageBreak/>
           <w:t xml:space="preserve">The rule below is </w:t>
         </w:r>
       </w:ins>
@@ -8400,13 +8379,7 @@
         <w:rPr>
           <w:color w:val="000000"/>
         </w:rPr>
-        <w:t xml:space="preserve">R13-2 </w:t>
-      </w:r>
-      <w:r>
-        <w:rPr>
-          <w:color w:val="000000"/>
-        </w:rPr>
-        <w:t>(Relation to the previous paper). The reviewer noted that the paper says the framework was presented before but never says what is original here, and that a journal paper needs that boundary drawn explicitly. The passage now separates the two: platform there, schema here, with the sections carrying the new material named. Open decision for you: the reviewer also suggested simply dropping the citation, since the conference paper covers an earlier and smaller subset of the work. The argument here does not depend on it, so removal is a live option — and it would also settle the question of whether ITcon permits citing an as-yet-unpublished conference paper.</w:t>
+        <w:t>R13-2 (Relation to the previous paper). The reviewer noted that the paper says the framework was presented before but never says what is original here, and that a journal paper needs that boundary drawn explicitly. The passage now separates the two: platform there, schema here, with the sections carrying the new material named. Open decision for you: the reviewer also suggested simply dropping the citation, since the conference paper covers an earlier and smaller subset of the work. The argument here does not depend on it, so removal is a live option — and it would also settle the question of whether ITcon permits citing an as-yet-unpublished conference paper.</w:t>
       </w:r>
     </w:p>
   </w:comment>
@@ -8419,13 +8392,7 @@
         <w:rPr>
           <w:color w:val="000000"/>
         </w:rPr>
-        <w:t xml:space="preserve">R13-3 </w:t>
-      </w:r>
-      <w:r>
-        <w:rPr>
-          <w:color w:val="000000"/>
-        </w:rPr>
-        <w:t>(Introduction and literature review). The reviewer found the review too compressed for journal standards — few references, few paragraphs — and the gap under-argued, while allowing that the selection itself may be deliberate. This paragraph organises the prior work into four strands, says what each makes durable and what it leaves unaddressed, and lands the gap on rule representation rather than rule execution. It cites only works already in the reference list, so no new sources need verifying; if more breadth is wanted, the natural additions are recent ITcon reviews of semantic-web adoption in AEC.</w:t>
+        <w:t>R13-3 (Introduction and literature review). The reviewer found the review too compressed for journal standards — few references, few paragraphs — and the gap under-argued, while allowing that the selection itself may be deliberate. This paragraph organises the prior work into four strands, says what each makes durable and what it leaves unaddressed, and lands the gap on rule representation rather than rule execution. It cites only works already in the reference list, so no new sources need verifying; if more breadth is wanted, the natural additions are recent ITcon reviews of semantic-web adoption in AEC.</w:t>
       </w:r>
     </w:p>
   </w:comment>
@@ -8441,10 +8408,7 @@
         <w:annotationRef/>
       </w:r>
       <w:r>
-        <w:t xml:space="preserve">[AU-C02] </w:t>
-      </w:r>
-      <w:r>
-        <w:t>"engine configuration" replaced: a rule in those approaches is a parameter set handed to a checking engine, which is what the sentence now says.</w:t>
+        <w:t>[AU-C02] "engine configuration" replaced: a rule in those approaches is a parameter set handed to a checking engine, which is what the sentence now says.</w:t>
       </w:r>
     </w:p>
   </w:comment>
@@ -8460,10 +8424,7 @@
         <w:annotationRef/>
       </w:r>
       <w:r>
-        <w:t xml:space="preserve">[AU-C03] </w:t>
-      </w:r>
-      <w:r>
-        <w:t>"tradition" removed. The word implied a history of addressing this gap that the paper does not evidence.</w:t>
+        <w:t>[AU-C03] "tradition" removed. The word implied a history of addressing this gap that the paper does not evidence.</w:t>
       </w:r>
     </w:p>
   </w:comment>
@@ -8479,10 +8440,7 @@
         <w:annotationRef/>
       </w:r>
       <w:r>
-        <w:t xml:space="preserve">Add </w:t>
-      </w:r>
-      <w:r>
-        <w:t xml:space="preserve">Function externalisation as </w:t>
+        <w:t xml:space="preserve">Add Function externalisation as </w:t>
       </w:r>
       <w:r>
         <w:t xml:space="preserve">a </w:t>
@@ -8504,10 +8462,7 @@
         <w:annotationRef/>
       </w:r>
       <w:r>
-        <w:t xml:space="preserve">[AU-C05] </w:t>
-      </w:r>
-      <w:r>
-        <w:t>Kept the compile description, which spec/DECISIONS.md ADR-4 confirms, and added the project-scoping the pipeline actually performs. Retrieval was not claimed, because none is implemented.</w:t>
+        <w:t>[AU-C05] Kept the compile description, which spec/DECISIONS.md ADR-4 confirms, and added the project-scoping the pipeline actually performs. Retrieval was not claimed, because none is implemented.</w:t>
       </w:r>
     </w:p>
   </w:comment>
@@ -8523,10 +8478,7 @@
         <w:annotationRef/>
       </w:r>
       <w:r>
-        <w:t xml:space="preserve">[R1-C04] </w:t>
-      </w:r>
-      <w:r>
-        <w:t>Table 6 split as directed: a dimensions-and-claim table enters section 1 as Table 1, the full comparison with citations stays in section 6.2 as Table 7, and the reader instruction is deleted. All table numbers shift by one and every reference follows.</w:t>
+        <w:t>[R1-C04] Table 6 split as directed: a dimensions-and-claim table enters section 1 as Table 1, the full comparison with citations stays in section 6.2 as Table 7, and the reader instruction is deleted. All table numbers shift by one and every reference follows.</w:t>
       </w:r>
     </w:p>
   </w:comment>
@@ -8542,10 +8494,7 @@
         <w:annotationRef/>
       </w:r>
       <w:r>
-        <w:t xml:space="preserve">[R1-C06] </w:t>
-      </w:r>
-      <w:r>
-        <w:t>Figure 1 reduced to the activities panel; the checkpoints panel is dropped and the caption follows.</w:t>
+        <w:t>[R1-C06] Figure 1 reduced to the activities panel; the checkpoints panel is dropped and the caption follows.</w:t>
       </w:r>
     </w:p>
   </w:comment>
@@ -8561,10 +8510,7 @@
         <w:annotationRef/>
       </w:r>
       <w:r>
-        <w:t xml:space="preserve">[R1-C06] </w:t>
-      </w:r>
-      <w:r>
-        <w:t>Figure 1 replaced by fig01_dev_process: the checkpoints panel is dropped and the activities panel becomes the whole figure, per the directive to shift focus to the activities. Source: figures/R14.2/fig01_dev_process.drawio.</w:t>
+        <w:t>[R1-C06] Figure 1 replaced by fig01_dev_process: the checkpoints panel is dropped and the activities panel becomes the whole figure, per the directive to shift focus to the activities. Source: figures/R14.2/fig01_dev_process.drawio.</w:t>
       </w:r>
     </w:p>
   </w:comment>
@@ -8580,10 +8526,7 @@
         <w:annotationRef/>
       </w:r>
       <w:r>
-        <w:t xml:space="preserve">[AU-C10] </w:t>
-      </w:r>
-      <w:r>
-        <w:t>Expanded to function–behaviour–structure at both occurrences; Gero (1990) is the FBS paper.</w:t>
+        <w:t>[AU-C10] Expanded to function–behaviour–structure at both occurrences; Gero (1990) is the FBS paper.</w:t>
       </w:r>
     </w:p>
   </w:comment>
@@ -8596,13 +8539,7 @@
         <w:rPr>
           <w:color w:val="000000"/>
         </w:rPr>
-        <w:t xml:space="preserve">R13-16 </w:t>
-      </w:r>
-      <w:r>
-        <w:rPr>
-          <w:color w:val="000000"/>
-        </w:rPr>
-        <w:t>(Editorial). A proof-reading pass over sentences the reviewer had to work through: a stray 'rather' here, 'developmetn' in section 5.2, and the opening sentence of the conclusion, which was ungrammatical as it stood. No substantive change in any of the three.</w:t>
+        <w:t>R13-16 (Editorial). A proof-reading pass over sentences the reviewer had to work through: a stray 'rather' here, 'developmetn' in section 5.2, and the opening sentence of the conclusion, which was ungrammatical as it stood. No substantive change in any of the three.</w:t>
       </w:r>
     </w:p>
   </w:comment>
@@ -8618,10 +8555,7 @@
         <w:annotationRef/>
       </w:r>
       <w:r>
-        <w:t xml:space="preserve">Compare </w:t>
-      </w:r>
-      <w:r>
-        <w:t xml:space="preserve">these two ontologies and justify the selection. There is a </w:t>
+        <w:t xml:space="preserve">Compare these two ontologies and justify the selection. There is a </w:t>
       </w:r>
       <w:r>
         <w:t>doubt</w:t>
@@ -8649,10 +8583,7 @@
         <w:annotationRef/>
       </w:r>
       <w:r>
-        <w:t xml:space="preserve">[AU-C08] </w:t>
-      </w:r>
-      <w:r>
-        <w:t>"vendor-neutral core" reads "core module" throughout, distinguishing the packaged module from the core band of concepts.</w:t>
+        <w:t>[AU-C08] "vendor-neutral core" reads "core module" throughout, distinguishing the packaged module from the core band of concepts.</w:t>
       </w:r>
     </w:p>
   </w:comment>
@@ -8668,10 +8599,7 @@
         <w:annotationRef/>
       </w:r>
       <w:r>
-        <w:t xml:space="preserve">[R1-C08] </w:t>
-      </w:r>
-      <w:r>
-        <w:t>New figure, placed under Table 3 as directed. Built from the module files, not from the table: it shows what each source contributes, by which mechanism (absorbed, imported, or declared), and what was left unaligned. Inserting it shifts Figures 2–9 to 3–10; all 19 references follow. Source: figures/R14.2/fig02_reuse_mapping.drawio, 8.03 pt at 170 mm.</w:t>
+        <w:t>[R1-C08] New figure, placed under Table 3 as directed. Built from the module files, not from the table: it shows what each source contributes, by which mechanism (absorbed, imported, or declared), and what was left unaligned. Inserting it shifts Figures 2–9 to 3–10; all 19 references follow. Source: figures/R14.2/fig02_reuse_mapping.drawio, 8.03 pt at 170 mm.</w:t>
       </w:r>
     </w:p>
   </w:comment>
@@ -8687,10 +8615,7 @@
         <w:annotationRef/>
       </w:r>
       <w:r>
-        <w:t xml:space="preserve">[R1-C05] </w:t>
-      </w:r>
-      <w:r>
-        <w:t>New subsection. States the three formalisation commitments — reified atoms, four typed atom kinds with ordered arguments, violation-form rules — without duplicating section 3.</w:t>
+        <w:t>[R1-C05] New subsection. States the three formalisation commitments — reified atoms, four typed atom kinds with ordered arguments, violation-form rules — without duplicating section 3.</w:t>
       </w:r>
     </w:p>
   </w:comment>
@@ -8709,10 +8634,7 @@
         <w:annotationRef/>
       </w:r>
       <w:r>
-        <w:t xml:space="preserve">Add </w:t>
-      </w:r>
-      <w:r>
-        <w:t xml:space="preserve">reference to </w:t>
+        <w:t xml:space="preserve">Add reference to </w:t>
       </w:r>
       <w:r>
         <w:t>GitHub</w:t>
@@ -8825,10 +8747,7 @@
         <w:annotationRef/>
       </w:r>
       <w:r>
-        <w:t xml:space="preserve">[AU-C20] </w:t>
-      </w:r>
-      <w:r>
-        <w:t>Justification of the five-layer partition added: bounded change, single ownership per reasoning service, and an open layer set.</w:t>
+        <w:t>[AU-C20] Justification of the five-layer partition added: bounded change, single ownership per reasoning service, and an open layer set.</w:t>
       </w:r>
     </w:p>
   </w:comment>
@@ -8857,10 +8776,7 @@
         <w:annotationRef/>
       </w:r>
       <w:r>
-        <w:t xml:space="preserve">Revise </w:t>
-      </w:r>
-      <w:r>
-        <w:t>after BOT and Topologic ontologies comparison and decision made</w:t>
+        <w:t>Revise after BOT and Topologic ontologies comparison and decision made</w:t>
       </w:r>
     </w:p>
   </w:comment>
@@ -8873,13 +8789,7 @@
         <w:rPr>
           <w:color w:val="000000"/>
         </w:rPr>
-        <w:t xml:space="preserve">R13-11 </w:t>
-      </w:r>
-      <w:r>
-        <w:rPr>
-          <w:color w:val="000000"/>
-        </w:rPr>
-        <w:t>(Design State and Neo4j operation). The reviewer remained unsure after section 3.3 whether a design state is a unit of the ontology, a part of the graph, or a different construct altogether, and asked what entities belong to it, what objects and parameters it records, how they are grouped, how a run is stored, and whether execution history stays in the graph. This passage answers each question in turn. If it now reads as implementation detail rather than schema, the alternative is to move it to an annex and leave a pointer here — though the reviewer's replicability objection argues for keeping it in the body.</w:t>
+        <w:t>R13-11 (Design State and Neo4j operation). The reviewer remained unsure after section 3.3 whether a design state is a unit of the ontology, a part of the graph, or a different construct altogether, and asked what entities belong to it, what objects and parameters it records, how they are grouped, how a run is stored, and whether execution history stays in the graph. This passage answers each question in turn. If it now reads as implementation detail rather than schema, the alternative is to move it to an annex and leave a pointer here — though the reviewer's replicability objection argues for keeping it in the body.</w:t>
       </w:r>
     </w:p>
   </w:comment>
@@ -8895,10 +8805,7 @@
         <w:annotationRef/>
       </w:r>
       <w:r>
-        <w:t xml:space="preserve">Clarify </w:t>
-      </w:r>
-      <w:r>
-        <w:t>that Design State is another key entity in proposed ontology which is widely used in Knowledge Graph of Design Grammars as a node</w:t>
+        <w:t>Clarify that Design State is another key entity in proposed ontology which is widely used in Knowledge Graph of Design Grammars as a node</w:t>
       </w:r>
       <w:r>
         <w:t>.</w:t>
@@ -8933,14 +8840,11 @@
         <w:annotationRef/>
       </w:r>
       <w:r>
-        <w:t xml:space="preserve">[AU-C25] </w:t>
-      </w:r>
-      <w:r>
-        <w:t>The original sentence was correct — per-object verdicts are stored as Run.ValidStatus and only their conjunction is derived. Wording made unambiguous rather than reversed.</w:t>
+        <w:t>[AU-C25] The original sentence was correct — per-object verdicts are stored as Run.ValidStatus and only their conjunction is derived. Wording made unambiguous rather than reversed.</w:t>
       </w:r>
     </w:p>
   </w:comment>
-  <w:comment w:id="86" w:author="Evgenii Ermolenko [2]" w:date="2026-08-23T14:06:00Z" w:initials="EE">
+  <w:comment w:id="86" w:author="Scientific Paper Revision Agent" w:date="2026-08-31T00:00:00Z" w:initials="SPRA">
     <w:p>
       <w:pPr>
         <w:pStyle w:val="af3"/>
@@ -8952,10 +8856,26 @@
         <w:annotationRef/>
       </w:r>
       <w:r>
-        <w:t xml:space="preserve">Substitute </w:t>
-      </w:r>
-      <w:r>
-        <w:t>examples of rules. Facade grid t</w:t>
+        <w:t>[C89] Upper-bound pattern</w:t>
+      </w:r>
+      <w:r>
+        <w:t xml:space="preserve"> named here, so that the complementary lower-bound pattern introduced with the street-width example has an antecedent; the construction mirrors it. Unit spelling aligned to metres. Author-approved 2026-08-31 (option A1).</w:t>
+      </w:r>
+    </w:p>
+  </w:comment>
+  <w:comment w:id="87" w:author="Evgenii Ermolenko [2]" w:date="2026-08-23T14:06:00Z" w:initials="EE">
+    <w:p>
+      <w:pPr>
+        <w:pStyle w:val="af3"/>
+      </w:pPr>
+      <w:r>
+        <w:rPr>
+          <w:rStyle w:val="af2"/>
+        </w:rPr>
+        <w:annotationRef/>
+      </w:r>
+      <w:r>
+        <w:t>Substitute examples of rules. Facade grid t</w:t>
       </w:r>
       <w:r>
         <w:t>y</w:t>
@@ -9312,7 +9232,7 @@
       </w:r>
     </w:p>
   </w:comment>
-  <w:comment w:id="88" w:author="Evgenii Ermolenko [2]" w:date="2026-08-30T12:59:00Z" w:initials="EE">
+  <w:comment w:id="89" w:author="Evgenii Ermolenko [2]" w:date="2026-08-30T12:59:00Z" w:initials="EE">
     <w:p>
       <w:pPr>
         <w:pStyle w:val="af3"/>
@@ -9337,7 +9257,7 @@
       </w:r>
     </w:p>
   </w:comment>
-  <w:comment w:id="89" w:author="Evgenii Ermolenko [2]" w:date="2026-08-31T18:21:00Z" w:initials="EE">
+  <w:comment w:id="90" w:author="Evgenii Ermolenko [2]" w:date="2026-08-31T18:21:00Z" w:initials="EE">
     <w:p>
       <w:pPr>
         <w:pStyle w:val="af3"/>
@@ -9374,7 +9294,7 @@
       </w:r>
     </w:p>
   </w:comment>
-  <w:comment w:id="112" w:author="Evgenii Ermolenko [2]" w:date="2026-08-30T13:24:00Z" w:initials="EE">
+  <w:comment w:id="113" w:author="Evgenii Ermolenko [2]" w:date="2026-08-30T13:24:00Z" w:initials="EE">
     <w:p>
       <w:pPr>
         <w:pStyle w:val="af3"/>
@@ -9389,10 +9309,7 @@
         <w:annotationRef/>
       </w:r>
       <w:r>
-        <w:t xml:space="preserve">Sounds </w:t>
-      </w:r>
-      <w:r>
-        <w:t xml:space="preserve">like limitation of the schema according to current development stage. If so, avoid mentioning it. The paper is </w:t>
+        <w:t xml:space="preserve">Sounds like limitation of the schema according to current development stage. If so, avoid mentioning it. The paper is </w:t>
       </w:r>
       <w:r>
         <w:t xml:space="preserve">theoretical and does not have to </w:t>
@@ -9405,7 +9322,7 @@
       </w:r>
     </w:p>
   </w:comment>
-  <w:comment w:id="116" w:author="Evgenii Ermolenko [2]" w:date="2026-08-23T20:11:00Z" w:initials="EE">
+  <w:comment w:id="117" w:author="Evgenii Ermolenko [2]" w:date="2026-08-23T20:11:00Z" w:initials="EE">
     <w:p>
       <w:pPr>
         <w:pStyle w:val="af3"/>
@@ -9421,7 +9338,7 @@
       </w:r>
     </w:p>
   </w:comment>
-  <w:comment w:id="122" w:author="Scientific Paper Revision Agent" w:date="2026-08-24T00:00:00Z" w:initials="SPRA">
+  <w:comment w:id="123" w:author="Scientific Paper Revision Agent" w:date="2026-08-24T00:00:00Z" w:initials="SPRA">
     <w:p>
       <w:pPr>
         <w:pStyle w:val="af3"/>
@@ -9433,14 +9350,11 @@
         <w:annotationRef/>
       </w:r>
       <w:r>
-        <w:t xml:space="preserve">[R1-C13] </w:t>
-      </w:r>
-      <w:r>
-        <w:t>Rewritten to the Ontograph-first account: a constraint resolves against declared entities before encoding, and the Ontograph grows where no match exists. The rule-shape catalogue is retained as what makes slot-filling tractable, and the pre-write check narrowed to what it actually validates.</w:t>
+        <w:t>[R1-C13] Rewritten to the Ontograph-first account: a constraint resolves against declared entities before encoding, and the Ontograph grows where no match exists. The rule-shape catalogue is retained as what makes slot-filling tractable, and the pre-write check narrowed to what it actually validates.</w:t>
       </w:r>
     </w:p>
   </w:comment>
-  <w:comment w:id="149" w:author="Evgenii Ermolenko [2]" w:date="2026-08-30T21:47:00Z" w:initials="EE">
+  <w:comment w:id="150" w:author="Evgenii Ermolenko [2]" w:date="2026-08-30T21:47:00Z" w:initials="EE">
     <w:p>
       <w:pPr>
         <w:pStyle w:val="af3"/>
@@ -9455,10 +9369,7 @@
         <w:annotationRef/>
       </w:r>
       <w:r>
-        <w:t xml:space="preserve">Avoid </w:t>
-      </w:r>
-      <w:r>
-        <w:t xml:space="preserve">all negative statements that explain </w:t>
+        <w:t xml:space="preserve">Avoid all negative statements that explain </w:t>
       </w:r>
       <w:r>
         <w:t>the decision</w:t>
@@ -9489,7 +9400,7 @@
       </w:r>
     </w:p>
   </w:comment>
-  <w:comment w:id="152" w:author="Evgenii Ermolenko" w:date="2026-08-17T19:27:00Z" w:initials="EE">
+  <w:comment w:id="153" w:author="Evgenii Ermolenko" w:date="2026-08-17T19:27:00Z" w:initials="EE">
     <w:p>
       <w:r>
         <w:annotationRef/>
@@ -9502,7 +9413,7 @@
       </w:r>
     </w:p>
   </w:comment>
-  <w:comment w:id="157" w:author="Evgenii Ermolenko [2]" w:date="2026-08-31T07:47:00Z" w:initials="EE">
+  <w:comment w:id="158" w:author="Evgenii Ermolenko [2]" w:date="2026-08-31T07:47:00Z" w:initials="EE">
     <w:p>
       <w:pPr>
         <w:pStyle w:val="af3"/>
@@ -9524,7 +9435,7 @@
       </w:r>
     </w:p>
   </w:comment>
-  <w:comment w:id="160" w:author="Scientific Paper Revision Agent" w:date="2026-08-24T00:00:00Z" w:initials="SPRA">
+  <w:comment w:id="161" w:author="Scientific Paper Revision Agent" w:date="2026-08-24T00:00:00Z" w:initials="SPRA">
     <w:p>
       <w:pPr>
         <w:pStyle w:val="af3"/>
@@ -9540,7 +9451,7 @@
       </w:r>
     </w:p>
   </w:comment>
-  <w:comment w:id="161" w:author="Evgenii Ermolenko [2]" w:date="2026-08-31T07:50:00Z" w:initials="EE">
+  <w:comment w:id="162" w:author="Evgenii Ermolenko [2]" w:date="2026-08-31T07:50:00Z" w:initials="EE">
     <w:p>
       <w:pPr>
         <w:pStyle w:val="af3"/>
@@ -9552,10 +9463,7 @@
         <w:annotationRef/>
       </w:r>
       <w:r>
-        <w:t xml:space="preserve">No </w:t>
-      </w:r>
-      <w:r>
-        <w:t xml:space="preserve">need to mention it. No need to </w:t>
+        <w:t xml:space="preserve">No need to mention it. No need to </w:t>
       </w:r>
       <w:r>
         <w:t>align</w:t>
@@ -9571,7 +9479,7 @@
       </w:r>
     </w:p>
   </w:comment>
-  <w:comment w:id="167" w:author="Evgenii Ermolenko [2]" w:date="2026-08-31T07:58:00Z" w:initials="EE">
+  <w:comment w:id="168" w:author="Evgenii Ermolenko [2]" w:date="2026-08-31T07:58:00Z" w:initials="EE">
     <w:p>
       <w:pPr>
         <w:pStyle w:val="af3"/>
@@ -9587,7 +9495,7 @@
       </w:r>
     </w:p>
   </w:comment>
-  <w:comment w:id="169" w:author="Evgenii Ermolenko [2]" w:date="2026-08-31T07:59:00Z" w:initials="EE">
+  <w:comment w:id="170" w:author="Evgenii Ermolenko [2]" w:date="2026-08-31T07:59:00Z" w:initials="EE">
     <w:p>
       <w:pPr>
         <w:pStyle w:val="af3"/>
@@ -9602,14 +9510,11 @@
         <w:annotationRef/>
       </w:r>
       <w:r>
-        <w:t xml:space="preserve">Change </w:t>
-      </w:r>
-      <w:r>
-        <w:t>the word - Discipline</w:t>
+        <w:t>Change the word - Discipline</w:t>
       </w:r>
     </w:p>
   </w:comment>
-  <w:comment w:id="171" w:author="Evgenii Ermolenko [2]" w:date="2026-08-31T11:05:00Z" w:initials="EE">
+  <w:comment w:id="172" w:author="Evgenii Ermolenko [2]" w:date="2026-08-31T11:05:00Z" w:initials="EE">
     <w:p>
       <w:pPr>
         <w:pStyle w:val="af3"/>
@@ -9625,7 +9530,7 @@
       </w:r>
     </w:p>
   </w:comment>
-  <w:comment w:id="175" w:author="Evgenii Ermolenko [2]" w:date="2026-08-31T11:09:00Z" w:initials="EE">
+  <w:comment w:id="176" w:author="Evgenii Ermolenko [2]" w:date="2026-08-31T11:09:00Z" w:initials="EE">
     <w:p>
       <w:pPr>
         <w:pStyle w:val="af3"/>
@@ -9637,14 +9542,11 @@
         <w:annotationRef/>
       </w:r>
       <w:r>
-        <w:t xml:space="preserve">Change </w:t>
-      </w:r>
-      <w:r>
-        <w:t>the word</w:t>
+        <w:t>Change the word</w:t>
       </w:r>
     </w:p>
   </w:comment>
-  <w:comment w:id="176" w:author="Evgenii Ermolenko" w:date="2026-08-17T19:27:00Z" w:initials="EE">
+  <w:comment w:id="177" w:author="Evgenii Ermolenko" w:date="2026-08-17T19:27:00Z" w:initials="EE">
     <w:p>
       <w:r>
         <w:annotationRef/>
@@ -9653,17 +9555,11 @@
         <w:rPr>
           <w:color w:val="000000"/>
         </w:rPr>
-        <w:t xml:space="preserve">See </w:t>
-      </w:r>
-      <w:r>
-        <w:rPr>
-          <w:color w:val="000000"/>
-        </w:rPr>
-        <w:t>R13-16 above — spacing and duplicated full stop.</w:t>
+        <w:t>See R13-16 above — spacing and duplicated full stop.</w:t>
       </w:r>
     </w:p>
   </w:comment>
-  <w:comment w:id="177" w:author="Evgenii Ermolenko [2]" w:date="2026-08-31T11:11:00Z" w:initials="EE">
+  <w:comment w:id="178" w:author="Evgenii Ermolenko [2]" w:date="2026-08-31T11:11:00Z" w:initials="EE">
     <w:p>
       <w:pPr>
         <w:pStyle w:val="af3"/>
@@ -9678,10 +9574,7 @@
         <w:annotationRef/>
       </w:r>
       <w:r>
-        <w:t xml:space="preserve">Paraphrise </w:t>
-      </w:r>
-      <w:r>
-        <w:t xml:space="preserve">the sentence to avoid </w:t>
+        <w:t xml:space="preserve">Paraphrise the sentence to avoid </w:t>
       </w:r>
       <w:r>
         <w:rPr>
@@ -9822,7 +9715,7 @@
       </w:r>
     </w:p>
   </w:comment>
-  <w:comment w:id="178" w:author="Evgenii Ermolenko [2]" w:date="2026-08-31T11:17:00Z" w:initials="EE">
+  <w:comment w:id="179" w:author="Evgenii Ermolenko [2]" w:date="2026-08-31T11:17:00Z" w:initials="EE">
     <w:p>
       <w:pPr>
         <w:pStyle w:val="af3"/>
@@ -9864,7 +9757,7 @@
       </w:r>
     </w:p>
   </w:comment>
-  <w:comment w:id="179" w:author="Evgenii Ermolenko [2]" w:date="2026-08-31T11:19:00Z" w:initials="EE">
+  <w:comment w:id="180" w:author="Evgenii Ermolenko [2]" w:date="2026-08-31T11:19:00Z" w:initials="EE">
     <w:p>
       <w:pPr>
         <w:pStyle w:val="af3"/>
@@ -9898,13 +9791,7 @@
         <w:rPr>
           <w:color w:val="000000"/>
         </w:rPr>
-        <w:t xml:space="preserve">R13-15 </w:t>
-      </w:r>
-      <w:r>
-        <w:rPr>
-          <w:color w:val="000000"/>
-        </w:rPr>
-        <w:t>(Reference correction). Corrected per the reviewer's follow-up note: this year's ptBIM conference is hosted by the University of Porto, not the University of Minho.</w:t>
+        <w:t>R13-15 (Reference correction). Corrected per the reviewer's follow-up note: this year's ptBIM conference is hosted by the University of Porto, not the University of Minho.</w:t>
       </w:r>
     </w:p>
   </w:comment>
@@ -9936,10 +9823,7 @@
         <w:annotationRef/>
       </w:r>
       <w:r>
-        <w:t xml:space="preserve">[R1-C14] </w:t>
-      </w:r>
-      <w:r>
-        <w:t>Annexes added from deposited artefacts only. The instruction to invent entities and results was declined; every value in Annexes A to C is read from the module files.</w:t>
+        <w:t>[R1-C14] Annexes added from deposited artefacts only. The instruction to invent entities and results was declined; every value in Annexes A to C is read from the module files.</w:t>
       </w:r>
     </w:p>
   </w:comment>
@@ -9955,10 +9839,7 @@
         <w:annotationRef/>
       </w:r>
       <w:r>
-        <w:t xml:space="preserve">[R1-C14] </w:t>
-      </w:r>
-      <w:r>
-        <w:t>Corrected to two. dg-disjointness.ttl declares owl:disjointWith twice; the three further string matches are inside comment lines. Caught by the Stage 8 validator.</w:t>
+        <w:t>[R1-C14] Corrected to two. dg-disjointness.ttl declares owl:disjointWith twice; the three further string matches are inside comment lines. Caught by the Stage 8 validator.</w:t>
       </w:r>
     </w:p>
   </w:comment>
@@ -9983,7 +9864,7 @@
   <w15:commentEx w15:paraId="28495DB2" w15:done="1"/>
   <w15:commentEx w15:paraId="4B76CE52" w15:done="1"/>
   <w15:commentEx w15:paraId="5197DEBD" w15:done="1"/>
-  <w15:commentEx w15:paraId="22D3DA54" w15:done="0"/>
+  <w15:commentEx w15:paraId="22D3DA54" w15:done="1"/>
   <w15:commentEx w15:paraId="22D2B8E2" w15:done="1"/>
   <w15:commentEx w15:paraId="05CF3C02" w15:done="1"/>
   <w15:commentEx w15:paraId="6F2D017C" w15:done="1"/>
@@ -9995,9 +9876,10 @@
   <w15:commentEx w15:paraId="46543980" w15:paraIdParent="41BFC973" w15:done="1"/>
   <w15:commentEx w15:paraId="66864704" w15:done="1"/>
   <w15:commentEx w15:paraId="5CA0BA74" w15:done="1"/>
+  <w15:commentEx w15:paraId="1C890001" w15:done="1"/>
   <w15:commentEx w15:paraId="1A563296" w15:done="1"/>
   <w15:commentEx w15:paraId="005FEAF6" w15:done="1"/>
-  <w15:commentEx w15:paraId="15C4F3B5" w15:done="0"/>
+  <w15:commentEx w15:paraId="15C4F3B5" w15:done="1"/>
   <w15:commentEx w15:paraId="6172B0AF" w15:done="0"/>
   <w15:commentEx w15:paraId="351FA49D" w15:done="0"/>
   <w15:commentEx w15:paraId="66BE369B" w15:done="1"/>
@@ -10009,11 +9891,11 @@
   <w15:commentEx w15:paraId="36870E38" w15:done="0"/>
   <w15:commentEx w15:paraId="56293E6D" w15:done="0"/>
   <w15:commentEx w15:paraId="2987F728" w15:done="0"/>
-  <w15:commentEx w15:paraId="1A423CDC" w15:done="0"/>
-  <w15:commentEx w15:paraId="7D24D792" w15:done="0"/>
-  <w15:commentEx w15:paraId="64175503" w15:done="0"/>
-  <w15:commentEx w15:paraId="2E748A12" w15:paraIdParent="64175503" w15:done="0"/>
-  <w15:commentEx w15:paraId="51CA5D9B" w15:done="0"/>
+  <w15:commentEx w15:paraId="1A423CDC" w15:done="1"/>
+  <w15:commentEx w15:paraId="7D24D792" w15:done="1"/>
+  <w15:commentEx w15:paraId="64175503" w15:done="1"/>
+  <w15:commentEx w15:paraId="2E748A12" w15:paraIdParent="64175503" w15:done="1"/>
+  <w15:commentEx w15:paraId="51CA5D9B" w15:done="1"/>
   <w15:commentEx w15:paraId="71D422F9" w15:done="0"/>
   <w15:commentEx w15:paraId="62F5E64C" w15:done="0"/>
   <w15:commentEx w15:paraId="7E53E533" w15:done="0"/>
@@ -10036,6 +9918,7 @@
   <w16cex:commentExtensible w16cex:durableId="2E355B0C" w16cex:dateUtc="2026-08-23T10:42:00Z"/>
   <w16cex:commentExtensible w16cex:durableId="56FAAECA" w16cex:dateUtc="2026-08-17T19:26:00Z"/>
   <w16cex:commentExtensible w16cex:durableId="2E3579EE" w16cex:dateUtc="2026-08-23T12:53:00Z"/>
+  <w16cex:commentExtensible w16cex:durableId="1C890001" w16cex:dateUtc="2026-08-31T00:00:00Z"/>
   <w16cex:commentExtensible w16cex:durableId="2E357CED" w16cex:dateUtc="2026-08-23T13:06:00Z"/>
   <w16cex:commentExtensible w16cex:durableId="2E3EA7C7" w16cex:dateUtc="2026-08-30T11:59:00Z"/>
   <w16cex:commentExtensible w16cex:durableId="2E404494" w16cex:dateUtc="2026-08-31T17:21:00Z"/>
@@ -10087,6 +9970,7 @@
   <w16cid:commentId w16cid:paraId="46543980" w16cid:durableId="2E3579EE"/>
   <w16cid:commentId w16cid:paraId="66864704" w16cid:durableId="66864704"/>
   <w16cid:commentId w16cid:paraId="5CA0BA74" w16cid:durableId="5CA0BA74"/>
+  <w16cid:commentId w16cid:paraId="1C890001" w16cid:durableId="1C890001"/>
   <w16cid:commentId w16cid:paraId="1A563296" w16cid:durableId="2E357CED"/>
   <w16cid:commentId w16cid:paraId="005FEAF6" w16cid:durableId="2E3EA7C7"/>
   <w16cid:commentId w16cid:paraId="15C4F3B5" w16cid:durableId="2E404494"/>

</xml_diff>